<commit_message>
Update report and presentation: offline drafts, 60 tests, screenshots
- Report: offline listing drafts throughout (objective 4 achieved),
  48 backend tests, production fixes in Section 5.6, new system tests
  TC-18/19, and eight app screenshots in Appendix C
- Presentation: matching counts and statuses, red tamper warning in the
  demo step and screenshot

Co-Authored-By: Claude Opus 5.5 <noreply@anthropic.com>
Claude-Session: https://claude.ai/code/session_01TkMBnKe3c5H95DS4zcaeu8
</commit_message>
<xml_diff>
--- a/docs/report/ZamMarket_Final_Report.docx
+++ b/docs/report/ZamMarket_Final_Report.docx
@@ -290,13 +290,13 @@
     <w:p>
       <w:pPr/>
       <w:r>
-        <w:t xml:space="preserve">This project designed, built and evaluated ZamMarket, a mobile-first progressive web application (PWA) that connects charcoal sellers and buyers in Lusaka neighbourhoods. Sellers register with a Zambian phone number, publish listings by typing or by speaking in English through the browser's Web Speech API, and chat with buyers in real time. Buyers browse listings filtered by neighbourhood, price and quantity. Each seller carries a trust score derived from a SHA-256 hash chain of events: listings created, buyer ratings and administrator verification. Any edit to, deletion of or reordering of a recorded event breaks the chain and is detected; the most recent event is protected by a hash stored on the seller's account. Each rating must belong to a conversation the buyer held with the seller, with one rating per conversation. A service worker caches the application shell and listing responses, and chat messages written offline are queued in IndexedDB and sent on reconnection. Settlement is in person and in cash, by design.</w:t>
+        <w:t xml:space="preserve">This project designed, built and evaluated ZamMarket, a mobile-first progressive web application (PWA) that connects charcoal sellers and buyers in Lusaka neighbourhoods. Sellers register with a Zambian phone number, publish listings by typing or by speaking in English through the browser's Web Speech API, and chat with buyers in real time. Buyers browse listings filtered by neighbourhood, price and quantity. Each seller carries a trust score derived from a SHA-256 hash chain of events: listings created, buyer ratings and administrator verification. Any edit to, deletion of or reordering of a recorded event breaks the chain and is detected; the most recent event is protected by a hash stored on the seller's account. Each rating must belong to a conversation the buyer held with the seller, with one rating per conversation. A service worker caches the application shell and listing responses, and chat messages and new listings (with photos) created offline are stored in IndexedDB and sent automatically on reconnection. Settlement is in person and in cash, by design.</w:t>
       </w:r>
     </w:p>
     <w:p>
       <w:pPr/>
       <w:r>
-        <w:t xml:space="preserve">The system was developed in four sprints with React, Redux Toolkit, Node.js, Express, MongoDB and Socket.io. An automated suite of 23 backend tests and 12 voice-parser tests passes, covering tamper detection (including the most recent event), authentication, rating rules and simultaneous writes; verifying a 1,000-block chain takes a few milliseconds. The voice parser handles spoken number words, prices with or without a currency word, bag sizes and the named neighbourhoods. A user usability study and production deployment were not completed at the time of writing. The results show that a lightweight hash chain can give informal traders a verifiable reputation without online payment, which no reviewed platform offers in combination with local discovery and intermittent connectivity.</w:t>
+        <w:t xml:space="preserve">The system was developed in four sprints with React, Redux Toolkit, Node.js, Express, MongoDB and Socket.io. An automated suite of 48 backend tests and 12 voice-parser tests passes, covering tamper detection (including the most recent event), authentication, rating rules and simultaneous writes; verifying a 1,000-block chain takes a few milliseconds. The voice parser handles spoken number words, prices with or without a currency word, bag sizes and the named neighbourhoods. A user usability study and production deployment were not completed at the time of writing. The results show that a lightweight hash chain can give informal traders a verifiable reputation without online payment, which no reviewed platform offers in combination with local discovery and intermittent connectivity.</w:t>
       </w:r>
     </w:p>
     <w:p>
@@ -1327,7 +1327,7 @@
         <w:t xml:space="preserve">Objective 4:</w:t>
       </w:r>
       <w:r>
-        <w:t xml:space="preserve"> To provide real-time buyer–seller messaging and offline support, including cached browsing and queuing of messages written without a connection.</w:t>
+        <w:t xml:space="preserve"> To provide real-time buyer–seller messaging and offline support, including cached browsing and queuing of messages and new listings created without a connection.</w:t>
       </w:r>
     </w:p>
     <w:p>
@@ -2391,7 +2391,7 @@
           <w:p>
             <w:pPr/>
             <w:r>
-              <w:t xml:space="preserve">Partial: cached browsing and queued messages</w:t>
+              <w:t xml:space="preserve">Yes: cached browsing, queued messages, offline listing drafts</w:t>
             </w:r>
           </w:p>
         </w:tc>
@@ -4265,7 +4265,7 @@
           <w:p>
             <w:pPr/>
             <w:r>
-              <w:t xml:space="preserve">Messages written offline are queued and sent automatically on reconnection</w:t>
+              <w:t xml:space="preserve">Messages and listings created offline are queued and sent automatically on reconnection</w:t>
             </w:r>
           </w:p>
         </w:tc>
@@ -6163,7 +6163,7 @@
         <w:t xml:space="preserve">offlineQueue.js</w:t>
       </w:r>
       <w:r>
-        <w:t xml:space="preserve">): a service worker serves static files cache-first and API GET requests network-first with cache fallback; messages typed while offline go to an IndexedDB store and are flushed when the browser fires </w:t>
+        <w:t xml:space="preserve">): a service worker serves static files cache-first and API GET requests network-first with cache fallback; messages typed while offline go to an IndexedDB store, as do listings created offline (photo included), which are posted automatically when the connection returns and are flushed when the browser fires </w:t>
       </w:r>
       <w:r>
         <w:rPr>
@@ -7157,6 +7157,30 @@
           <w:p>
             <w:pPr/>
             <w:r>
+              <w:t xml:space="preserve">A tampered chain still displayed a green "Trusted Seller" score</w:t>
+            </w:r>
+          </w:p>
+        </w:tc>
+        <w:tc>
+          <w:tcPr>
+            <w:tcW w:w="4680" w:type="dxa"/>
+          </w:tcPr>
+          <w:p>
+            <w:pPr/>
+            <w:r>
+              <w:t xml:space="preserve">The trust page now switches to a red warning: "Record has been altered"</w:t>
+            </w:r>
+          </w:p>
+        </w:tc>
+      </w:tr>
+      <w:tr>
+        <w:tc>
+          <w:tcPr>
+            <w:tcW w:w="4680" w:type="dxa"/>
+          </w:tcPr>
+          <w:p>
+            <w:pPr/>
+            <w:r>
               <w:t xml:space="preserve">Two trust events at the same moment could take the same block position and fork the chain</w:t>
             </w:r>
           </w:p>
@@ -7429,16 +7453,88 @@
               <w:t xml:space="preserve">localhost</w:t>
             </w:r>
             <w:r>
-              <w:t xml:space="preserve"> origins; the service worker pre-cached development-only files; and refreshing a page on Vercel returned 404. Addresses now come from environment variables and </w:t>
+              <w:t xml:space="preserve"> origins; the service worker pre-cached development-only files; and refreshing a page on Vercel returned 404</w:t>
+            </w:r>
+          </w:p>
+        </w:tc>
+      </w:tr>
+      <w:tr>
+        <w:tc>
+          <w:tcPr>
+            <w:tcW w:w="4680" w:type="dxa"/>
+          </w:tcPr>
+          <w:p>
+            <w:pPr/>
+            <w:r>
+              <w:t xml:space="preserve">Creating a listing failed in production with only "Failed to create listing"</w:t>
+            </w:r>
+          </w:p>
+        </w:tc>
+        <w:tc>
+          <w:tcPr>
+            <w:tcW w:w="4680" w:type="dxa"/>
+          </w:tcPr>
+          <w:p>
+            <w:pPr/>
+            <w:r>
+              <w:t xml:space="preserve">Phone photos over 5 MB are now shrunk in the browser; the request waits up to 90 seconds for a sleeping free-tier server; the app shows the specific cause; </w:t>
             </w:r>
             <w:r>
               <w:rPr>
                 <w:rStyle w:val="CodeChar"/>
               </w:rPr>
-              <w:t xml:space="preserve">vercel.json</w:t>
-            </w:r>
-            <w:r>
-              <w:t xml:space="preserve"> routes pages to the app. Redeployment is pending</w:t>
+              <w:t xml:space="preserve">/api/health</w:t>
+            </w:r>
+            <w:r>
+              <w:t xml:space="preserve"> reports database and Cloudinary status</w:t>
+            </w:r>
+          </w:p>
+        </w:tc>
+      </w:tr>
+      <w:tr>
+        <w:tc>
+          <w:tcPr>
+            <w:tcW w:w="4680" w:type="dxa"/>
+          </w:tcPr>
+          <w:p>
+            <w:pPr/>
+            <w:r>
+              <w:t xml:space="preserve">Creating a listing without a connection failed</w:t>
+            </w:r>
+          </w:p>
+        </w:tc>
+        <w:tc>
+          <w:tcPr>
+            <w:tcW w:w="4680" w:type="dxa"/>
+          </w:tcPr>
+          <w:p>
+            <w:pPr/>
+            <w:r>
+              <w:t xml:space="preserve">Offline listing drafts: saved with the photo in IndexedDB and posted automatically on reconnection</w:t>
+            </w:r>
+          </w:p>
+        </w:tc>
+      </w:tr>
+      <w:tr>
+        <w:tc>
+          <w:tcPr>
+            <w:tcW w:w="4680" w:type="dxa"/>
+          </w:tcPr>
+          <w:p>
+            <w:pPr/>
+            <w:r>
+              <w:t xml:space="preserve">Two test styles (Node's runner and Jest) could not run together</w:t>
+            </w:r>
+          </w:p>
+        </w:tc>
+        <w:tc>
+          <w:tcPr>
+            <w:tcW w:w="4680" w:type="dxa"/>
+          </w:tcPr>
+          <w:p>
+            <w:pPr/>
+            <w:r>
+              <w:t xml:space="preserve">All backend tests run under Jest: 48 tests</w:t>
             </w:r>
           </w:p>
         </w:tc>
@@ -7491,7 +7587,7 @@
     <w:p>
       <w:pPr/>
       <w:r>
-        <w:t xml:space="preserve">The automated test suite passes in full: 23 backend tests and 12 voice-parser tests. System tests of each user story and the usability study are reported below; where a test has not yet been run, its result is left blank rather than assumed. This chapter sets out the strategy, the results, their analysis and an evaluation against each objective.</w:t>
+        <w:t xml:space="preserve">The automated test suite passes in full: 48 backend tests and 12 voice-parser tests. System tests of each user story and the usability study are reported below; where a test has not yet been run, its result is left blank rather than assumed. This chapter sets out the strategy, the results, their analysis and an evaluation against each objective.</w:t>
       </w:r>
     </w:p>
     <w:p>
@@ -7535,7 +7631,7 @@
         <w:t xml:space="preserve">backend/</w:t>
       </w:r>
       <w:r>
-        <w:t xml:space="preserve"> runs 23 tests of the trust chain, authentication middleware, registration, rating rules, simultaneous trust events, allowed origins and search escaping. Database models are replaced by stubs, so no database is needed. </w:t>
+        <w:t xml:space="preserve"> runs 48 Jest tests: the trust chain and block creation, authentication middleware, registration, the User model (phone validation, password checks, phone masking), rating rules, simultaneous trust events, allowed origins, upload errors and search escaping. Database models are replaced by stubs, so no database is needed. </w:t>
       </w:r>
       <w:r>
         <w:rPr>
@@ -9072,7 +9168,7 @@
     <w:p>
       <w:pPr/>
       <w:r>
-        <w:t xml:space="preserve">Test B17 shows why the head hash was added. Checking links alone cannot detect an edit to the most recent block, because no later block points to it; comparing that block with the hash saved on the seller's account catches the edit.</w:t>
+        <w:t xml:space="preserve">A further 25 tests, in backend/__tests__ and for upload errors, cover block creation, the User model (phone validation, password checks and phone masking) and photo-upload error messages. Test B17 shows why the head hash was added. Checking links alone cannot detect an edit to the most recent block, because no later block points to it; comparing that block with the hash saved on the seller's account catches the edit.</w:t>
       </w:r>
     </w:p>
     <w:p>
@@ -10418,7 +10514,7 @@
           <w:p>
             <w:pPr/>
             <w:r>
-              <w:t xml:space="preserve">Chain shown as invalid</w:t>
+              <w:t xml:space="preserve">Red warning: record has been altered</w:t>
             </w:r>
           </w:p>
         </w:tc>
@@ -10658,6 +10754,98 @@
             <w:pPr/>
             <w:r>
               <w:t xml:space="preserve">Pages load; chat connects</w:t>
+            </w:r>
+          </w:p>
+        </w:tc>
+        <w:tc>
+          <w:tcPr>
+            <w:tcW w:w="2340" w:type="dxa"/>
+          </w:tcPr>
+          <w:p>
+            <w:pPr/>
+            <w:r>
+              <w:t xml:space="preserve">[Pass/Fail]</w:t>
+            </w:r>
+          </w:p>
+        </w:tc>
+      </w:tr>
+      <w:tr>
+        <w:tc>
+          <w:tcPr>
+            <w:tcW w:w="2340" w:type="dxa"/>
+          </w:tcPr>
+          <w:p>
+            <w:pPr/>
+            <w:r>
+              <w:t xml:space="preserve">TC-18</w:t>
+            </w:r>
+          </w:p>
+        </w:tc>
+        <w:tc>
+          <w:tcPr>
+            <w:tcW w:w="2340" w:type="dxa"/>
+          </w:tcPr>
+          <w:p>
+            <w:pPr/>
+            <w:r>
+              <w:t xml:space="preserve">Seller creates a listing with a photo while offline, then reconnects</w:t>
+            </w:r>
+          </w:p>
+        </w:tc>
+        <w:tc>
+          <w:tcPr>
+            <w:tcW w:w="2340" w:type="dxa"/>
+          </w:tcPr>
+          <w:p>
+            <w:pPr/>
+            <w:r>
+              <w:t xml:space="preserve">Saved as a draft; posted automatically on reconnection</w:t>
+            </w:r>
+          </w:p>
+        </w:tc>
+        <w:tc>
+          <w:tcPr>
+            <w:tcW w:w="2340" w:type="dxa"/>
+          </w:tcPr>
+          <w:p>
+            <w:pPr/>
+            <w:r>
+              <w:t xml:space="preserve">[Pass/Fail]</w:t>
+            </w:r>
+          </w:p>
+        </w:tc>
+      </w:tr>
+      <w:tr>
+        <w:tc>
+          <w:tcPr>
+            <w:tcW w:w="2340" w:type="dxa"/>
+          </w:tcPr>
+          <w:p>
+            <w:pPr/>
+            <w:r>
+              <w:t xml:space="preserve">TC-19</w:t>
+            </w:r>
+          </w:p>
+        </w:tc>
+        <w:tc>
+          <w:tcPr>
+            <w:tcW w:w="2340" w:type="dxa"/>
+          </w:tcPr>
+          <w:p>
+            <w:pPr/>
+            <w:r>
+              <w:t xml:space="preserve">Seller uploads a photo over 5 MB from a phone</w:t>
+            </w:r>
+          </w:p>
+        </w:tc>
+        <w:tc>
+          <w:tcPr>
+            <w:tcW w:w="2340" w:type="dxa"/>
+          </w:tcPr>
+          <w:p>
+            <w:pPr/>
+            <w:r>
+              <w:t xml:space="preserve">Photo shrunk on the phone; listing created</w:t>
             </w:r>
           </w:p>
         </w:tc>
@@ -10887,7 +11075,7 @@
           <w:p>
             <w:pPr/>
             <w:r>
-              <w:t xml:space="preserve">23 of 23 backend tests pass, including the head-hash check and per-conversation rating</w:t>
+              <w:t xml:space="preserve">48 of 48 backend tests pass, including the head-hash check and per-conversation rating</w:t>
             </w:r>
           </w:p>
         </w:tc>
@@ -10933,7 +11121,7 @@
           <w:p>
             <w:pPr/>
             <w:r>
-              <w:t xml:space="preserve">Achieved for chat and cached reading; listing creation still needs a connection</w:t>
+              <w:t xml:space="preserve">Achieved: chat, cached reading and offline listing drafts; ratings still need a connection</w:t>
             </w:r>
           </w:p>
         </w:tc>
@@ -11071,7 +11259,7 @@
         <w:t xml:space="preserve">Connectivity.</w:t>
       </w:r>
       <w:r>
-        <w:t xml:space="preserve"> Research Question 3 is answered in part. A PWA can cache what the user has already seen and queue chat messages, which covers the moments a trader most needs: checking a listing and arranging collection. It cannot easily create listings offline, because photo upload and the trust event both need the server, and speech recognition in Chrome itself needs a connection.</w:t>
+        <w:t xml:space="preserve"> Research Question 3 is answered largely positively. A PWA can cache what the user has already seen, queue chat messages and hold new listings, photo included, until the connection returns, which covers the moments a trader most needs. What cannot happen offline is anything that needs the server at that moment: a listing enters the trust chain only when it reaches the server, ratings need a connection, and speech recognition in Chrome itself needs a connection.</w:t>
       </w:r>
     </w:p>
     <w:p>
@@ -11272,10 +11460,10 @@
         <w:rPr>
           <w:b/>
         </w:rPr>
-        <w:t xml:space="preserve">Partial offline support.</w:t>
-      </w:r>
-      <w:r>
-        <w:t xml:space="preserve"> Listing creation and ratings need a connection.</w:t>
+        <w:t xml:space="preserve">Offline limits.</w:t>
+      </w:r>
+      <w:r>
+        <w:t xml:space="preserve"> Ratings and voice input need a connection; a listing created offline is posted, and enters the trust chain, only when the connection returns.</w:t>
       </w:r>
     </w:p>
     <w:p>
@@ -11373,7 +11561,7 @@
     <w:p>
       <w:pPr/>
       <w:r>
-        <w:t xml:space="preserve">Informal charcoal sellers in Lusaka lack a way to reach nearby buyers, and buyers lack a way to judge sellers they have not met. Existing platforms offer either local discovery without trust or trust that depends on online payment. Over four agile sprints and a stabilisation period, this project built ZamMarket, a mobile-first PWA with neighbourhood-based discovery, English voice-based listing creation, real-time chat with offline queuing, and a seller trust score backed by a SHA-256 hash chain with conversation-gated ratings. Unit tests confirmed that the chain detects edited, deleted and reordered history and verifies 1,000 blocks in a few milliseconds. An automated suite of 35 tests, run on every push, confirms the trust chain (including the most recent event), the rating rules and the voice parser. Usability testing and redeployment remain outstanding.</w:t>
+        <w:t xml:space="preserve">Informal charcoal sellers in Lusaka lack a way to reach nearby buyers, and buyers lack a way to judge sellers they have not met. Existing platforms offer either local discovery without trust or trust that depends on online payment. Over four agile sprints and a stabilisation period, this project built ZamMarket, a mobile-first PWA with neighbourhood-based discovery, English voice-based listing creation, real-time chat with offline queuing, and a seller trust score backed by a SHA-256 hash chain with conversation-gated ratings. Unit tests confirmed that the chain detects edited, deleted and reordered history and verifies 1,000 blocks in a few milliseconds. An automated suite of 60 tests, run on every push, confirms the trust chain (including the most recent event), the rating rules and the voice parser. Usability testing and redeployment remain outstanding.</w:t>
       </w:r>
     </w:p>
     <w:p>
@@ -11429,7 +11617,7 @@
         </w:numPr>
       </w:pPr>
       <w:r>
-        <w:t xml:space="preserve">A PWA can keep reading and messaging working through connection drops, but actions that create server-side records still need connectivity.</w:t>
+        <w:t xml:space="preserve">A PWA can keep reading, messaging and listing creation working through connection drops by holding writes on the phone until the connection returns.</w:t>
       </w:r>
     </w:p>
     <w:p>
@@ -11509,7 +11697,7 @@
         <w:t xml:space="preserve">Objective 4 (messaging and offline):</w:t>
       </w:r>
       <w:r>
-        <w:t xml:space="preserve"> achieved for chat and cached browsing; offline listing creation not provided.</w:t>
+        <w:t xml:space="preserve"> achieved: chat, cached browsing and offline listing drafts.</w:t>
       </w:r>
     </w:p>
     <w:p>
@@ -11747,10 +11935,10 @@
         <w:rPr>
           <w:b/>
         </w:rPr>
-        <w:t xml:space="preserve">Offline listing drafts</w:t>
-      </w:r>
-      <w:r>
-        <w:t xml:space="preserve"> saved to IndexedDB and submitted, with photo, when the connection returns.</w:t>
+        <w:t xml:space="preserve">Offline ratings</w:t>
+      </w:r>
+      <w:r>
+        <w:t xml:space="preserve"> queued like messages, so a buyer can rate a seller straight after collection without a signal.</w:t>
       </w:r>
     </w:p>
     <w:p>
@@ -12702,7 +12890,7 @@
         <w:t xml:space="preserve">Install:</w:t>
       </w:r>
       <w:r>
-        <w:t xml:space="preserve"> in Chrome, use "Add to Home screen". Listings you have opened stay viewable without a connection, and messages you send offline are delivered when you reconnect.</w:t>
+        <w:t xml:space="preserve"> in Chrome, use "Add to Home screen". Listings you have opened stay viewable without a connection, and messages and listings you create offline are sent when you reconnect.</w:t>
       </w:r>
     </w:p>
     <w:p>
@@ -12716,7 +12904,367 @@
     <w:p>
       <w:pPr/>
       <w:r>
-        <w:t xml:space="preserve">[Insert screenshots of each main screen, an entity-relationship diagram of the six collections, and sequence diagrams for registration, messaging and rating.]</w:t>
+        <w:t xml:space="preserve">Screens from the running application (local installation, sample data), captured at phone width.</w:t>
+      </w:r>
+    </w:p>
+    <w:p>
+      <w:pPr/>
+      <w:r>
+        <w:rPr>
+          <w:b/>
+        </w:rPr>
+        <w:t xml:space="preserve">Figure C.1: Browse with neighbourhood filters</w:t>
+      </w:r>
+    </w:p>
+    <w:p>
+      <w:pPr/>
+      <w:r>
+        <w:drawing>
+          <wp:inline distT="0" distB="0" distL="0" distR="0">
+            <wp:extent cx="3464752" cy="7498080"/>
+            <wp:docPr id="3" name="image3" descr="Browse with neighbourhood filters"/>
+            <a:graphic xmlns:a="http://schemas.openxmlformats.org/drawingml/2006/main">
+              <a:graphicData uri="http://schemas.openxmlformats.org/drawingml/2006/picture">
+                <pic:pic xmlns:pic="http://schemas.openxmlformats.org/drawingml/2006/picture">
+                  <pic:nvPicPr>
+                    <pic:cNvPr id="3" name="image3" descr="Browse with neighbourhood filters"/>
+                    <pic:cNvPicPr/>
+                  </pic:nvPicPr>
+                  <pic:blipFill>
+                    <a:blip r:embed="rId19"/>
+                    <a:stretch>
+                      <a:fillRect/>
+                    </a:stretch>
+                  </pic:blipFill>
+                  <pic:spPr>
+                    <a:xfrm>
+                      <a:off x="0" y="0"/>
+                      <a:ext cx="3464752" cy="7498080"/>
+                    </a:xfrm>
+                    <a:prstGeom prst="rect">
+                      <a:avLst/>
+                    </a:prstGeom>
+                  </pic:spPr>
+                </pic:pic>
+              </a:graphicData>
+            </a:graphic>
+          </wp:inline>
+        </w:drawing>
+      </w:r>
+    </w:p>
+    <w:p>
+      <w:pPr/>
+      <w:r>
+        <w:rPr>
+          <w:b/>
+        </w:rPr>
+        <w:t xml:space="preserve">Figure C.2: Listing detail with the seller's trust score</w:t>
+      </w:r>
+    </w:p>
+    <w:p>
+      <w:pPr/>
+      <w:r>
+        <w:drawing>
+          <wp:inline distT="0" distB="0" distL="0" distR="0">
+            <wp:extent cx="3464752" cy="7498080"/>
+            <wp:docPr id="4" name="image4" descr="Listing detail"/>
+            <a:graphic xmlns:a="http://schemas.openxmlformats.org/drawingml/2006/main">
+              <a:graphicData uri="http://schemas.openxmlformats.org/drawingml/2006/picture">
+                <pic:pic xmlns:pic="http://schemas.openxmlformats.org/drawingml/2006/picture">
+                  <pic:nvPicPr>
+                    <pic:cNvPr id="4" name="image4" descr="Listing detail"/>
+                    <pic:cNvPicPr/>
+                  </pic:nvPicPr>
+                  <pic:blipFill>
+                    <a:blip r:embed="rId20"/>
+                    <a:stretch>
+                      <a:fillRect/>
+                    </a:stretch>
+                  </pic:blipFill>
+                  <pic:spPr>
+                    <a:xfrm>
+                      <a:off x="0" y="0"/>
+                      <a:ext cx="3464752" cy="7498080"/>
+                    </a:xfrm>
+                    <a:prstGeom prst="rect">
+                      <a:avLst/>
+                    </a:prstGeom>
+                  </pic:spPr>
+                </pic:pic>
+              </a:graphicData>
+            </a:graphic>
+          </wp:inline>
+        </w:drawing>
+      </w:r>
+    </w:p>
+    <w:p>
+      <w:pPr/>
+      <w:r>
+        <w:rPr>
+          <w:b/>
+        </w:rPr>
+        <w:t xml:space="preserve">Figure C.3: Voice listing panel with editable transcript and extracted fields</w:t>
+      </w:r>
+    </w:p>
+    <w:p>
+      <w:pPr/>
+      <w:r>
+        <w:drawing>
+          <wp:inline distT="0" distB="0" distL="0" distR="0">
+            <wp:extent cx="3464752" cy="7498080"/>
+            <wp:docPr id="5" name="image5" descr="Voice listing panel"/>
+            <a:graphic xmlns:a="http://schemas.openxmlformats.org/drawingml/2006/main">
+              <a:graphicData uri="http://schemas.openxmlformats.org/drawingml/2006/picture">
+                <pic:pic xmlns:pic="http://schemas.openxmlformats.org/drawingml/2006/picture">
+                  <pic:nvPicPr>
+                    <pic:cNvPr id="5" name="image5" descr="Voice listing panel"/>
+                    <pic:cNvPicPr/>
+                  </pic:nvPicPr>
+                  <pic:blipFill>
+                    <a:blip r:embed="rId21"/>
+                    <a:stretch>
+                      <a:fillRect/>
+                    </a:stretch>
+                  </pic:blipFill>
+                  <pic:spPr>
+                    <a:xfrm>
+                      <a:off x="0" y="0"/>
+                      <a:ext cx="3464752" cy="7498080"/>
+                    </a:xfrm>
+                    <a:prstGeom prst="rect">
+                      <a:avLst/>
+                    </a:prstGeom>
+                  </pic:spPr>
+                </pic:pic>
+              </a:graphicData>
+            </a:graphic>
+          </wp:inline>
+        </w:drawing>
+      </w:r>
+    </w:p>
+    <w:p>
+      <w:pPr/>
+      <w:r>
+        <w:rPr>
+          <w:b/>
+        </w:rPr>
+        <w:t xml:space="preserve">Figure C.4: Listing form pre-filled from voice</w:t>
+      </w:r>
+    </w:p>
+    <w:p>
+      <w:pPr/>
+      <w:r>
+        <w:drawing>
+          <wp:inline distT="0" distB="0" distL="0" distR="0">
+            <wp:extent cx="3464752" cy="7498080"/>
+            <wp:docPr id="6" name="image6" descr="Listing form pre-filled from voice"/>
+            <a:graphic xmlns:a="http://schemas.openxmlformats.org/drawingml/2006/main">
+              <a:graphicData uri="http://schemas.openxmlformats.org/drawingml/2006/picture">
+                <pic:pic xmlns:pic="http://schemas.openxmlformats.org/drawingml/2006/picture">
+                  <pic:nvPicPr>
+                    <pic:cNvPr id="6" name="image6" descr="Listing form pre-filled from voice"/>
+                    <pic:cNvPicPr/>
+                  </pic:nvPicPr>
+                  <pic:blipFill>
+                    <a:blip r:embed="rId22"/>
+                    <a:stretch>
+                      <a:fillRect/>
+                    </a:stretch>
+                  </pic:blipFill>
+                  <pic:spPr>
+                    <a:xfrm>
+                      <a:off x="0" y="0"/>
+                      <a:ext cx="3464752" cy="7498080"/>
+                    </a:xfrm>
+                    <a:prstGeom prst="rect">
+                      <a:avLst/>
+                    </a:prstGeom>
+                  </pic:spPr>
+                </pic:pic>
+              </a:graphicData>
+            </a:graphic>
+          </wp:inline>
+        </w:drawing>
+      </w:r>
+    </w:p>
+    <w:p>
+      <w:pPr/>
+      <w:r>
+        <w:rPr>
+          <w:b/>
+        </w:rPr>
+        <w:t xml:space="preserve">Figure C.5: Chat with the rating prompt</w:t>
+      </w:r>
+    </w:p>
+    <w:p>
+      <w:pPr/>
+      <w:r>
+        <w:drawing>
+          <wp:inline distT="0" distB="0" distL="0" distR="0">
+            <wp:extent cx="3464752" cy="7498080"/>
+            <wp:docPr id="7" name="image7" descr="Chat with rating prompt"/>
+            <a:graphic xmlns:a="http://schemas.openxmlformats.org/drawingml/2006/main">
+              <a:graphicData uri="http://schemas.openxmlformats.org/drawingml/2006/picture">
+                <pic:pic xmlns:pic="http://schemas.openxmlformats.org/drawingml/2006/picture">
+                  <pic:nvPicPr>
+                    <pic:cNvPr id="7" name="image7" descr="Chat with rating prompt"/>
+                    <pic:cNvPicPr/>
+                  </pic:nvPicPr>
+                  <pic:blipFill>
+                    <a:blip r:embed="rId23"/>
+                    <a:stretch>
+                      <a:fillRect/>
+                    </a:stretch>
+                  </pic:blipFill>
+                  <pic:spPr>
+                    <a:xfrm>
+                      <a:off x="0" y="0"/>
+                      <a:ext cx="3464752" cy="7498080"/>
+                    </a:xfrm>
+                    <a:prstGeom prst="rect">
+                      <a:avLst/>
+                    </a:prstGeom>
+                  </pic:spPr>
+                </pic:pic>
+              </a:graphicData>
+            </a:graphic>
+          </wp:inline>
+        </w:drawing>
+      </w:r>
+    </w:p>
+    <w:p>
+      <w:pPr/>
+      <w:r>
+        <w:rPr>
+          <w:b/>
+        </w:rPr>
+        <w:t xml:space="preserve">Figure C.6: Trust score with a valid chain</w:t>
+      </w:r>
+    </w:p>
+    <w:p>
+      <w:pPr/>
+      <w:r>
+        <w:drawing>
+          <wp:inline distT="0" distB="0" distL="0" distR="0">
+            <wp:extent cx="3464752" cy="7498080"/>
+            <wp:docPr id="8" name="image8" descr="Trust score, valid chain"/>
+            <a:graphic xmlns:a="http://schemas.openxmlformats.org/drawingml/2006/main">
+              <a:graphicData uri="http://schemas.openxmlformats.org/drawingml/2006/picture">
+                <pic:pic xmlns:pic="http://schemas.openxmlformats.org/drawingml/2006/picture">
+                  <pic:nvPicPr>
+                    <pic:cNvPr id="8" name="image8" descr="Trust score, valid chain"/>
+                    <pic:cNvPicPr/>
+                  </pic:nvPicPr>
+                  <pic:blipFill>
+                    <a:blip r:embed="rId24"/>
+                    <a:stretch>
+                      <a:fillRect/>
+                    </a:stretch>
+                  </pic:blipFill>
+                  <pic:spPr>
+                    <a:xfrm>
+                      <a:off x="0" y="0"/>
+                      <a:ext cx="3464752" cy="7498080"/>
+                    </a:xfrm>
+                    <a:prstGeom prst="rect">
+                      <a:avLst/>
+                    </a:prstGeom>
+                  </pic:spPr>
+                </pic:pic>
+              </a:graphicData>
+            </a:graphic>
+          </wp:inline>
+        </w:drawing>
+      </w:r>
+    </w:p>
+    <w:p>
+      <w:pPr/>
+      <w:r>
+        <w:rPr>
+          <w:b/>
+        </w:rPr>
+        <w:t xml:space="preserve">Figure C.7: Trust score after tampering: verification fails</w:t>
+      </w:r>
+    </w:p>
+    <w:p>
+      <w:pPr/>
+      <w:r>
+        <w:drawing>
+          <wp:inline distT="0" distB="0" distL="0" distR="0">
+            <wp:extent cx="3464752" cy="7498080"/>
+            <wp:docPr id="9" name="image9" descr="Trust score, tampered chain"/>
+            <a:graphic xmlns:a="http://schemas.openxmlformats.org/drawingml/2006/main">
+              <a:graphicData uri="http://schemas.openxmlformats.org/drawingml/2006/picture">
+                <pic:pic xmlns:pic="http://schemas.openxmlformats.org/drawingml/2006/picture">
+                  <pic:nvPicPr>
+                    <pic:cNvPr id="9" name="image9" descr="Trust score, tampered chain"/>
+                    <pic:cNvPicPr/>
+                  </pic:nvPicPr>
+                  <pic:blipFill>
+                    <a:blip r:embed="rId25"/>
+                    <a:stretch>
+                      <a:fillRect/>
+                    </a:stretch>
+                  </pic:blipFill>
+                  <pic:spPr>
+                    <a:xfrm>
+                      <a:off x="0" y="0"/>
+                      <a:ext cx="3464752" cy="7498080"/>
+                    </a:xfrm>
+                    <a:prstGeom prst="rect">
+                      <a:avLst/>
+                    </a:prstGeom>
+                  </pic:spPr>
+                </pic:pic>
+              </a:graphicData>
+            </a:graphic>
+          </wp:inline>
+        </w:drawing>
+      </w:r>
+    </w:p>
+    <w:p>
+      <w:pPr/>
+      <w:r>
+        <w:rPr>
+          <w:b/>
+        </w:rPr>
+        <w:t xml:space="preserve">Figure C.8: My Listings with a listing saved offline, waiting to post</w:t>
+      </w:r>
+    </w:p>
+    <w:p>
+      <w:pPr/>
+      <w:r>
+        <w:drawing>
+          <wp:inline distT="0" distB="0" distL="0" distR="0">
+            <wp:extent cx="5486400" cy="3086100"/>
+            <wp:docPr id="10" name="image10" descr="Offline listing draft waiting to post"/>
+            <a:graphic xmlns:a="http://schemas.openxmlformats.org/drawingml/2006/main">
+              <a:graphicData uri="http://schemas.openxmlformats.org/drawingml/2006/picture">
+                <pic:pic xmlns:pic="http://schemas.openxmlformats.org/drawingml/2006/picture">
+                  <pic:nvPicPr>
+                    <pic:cNvPr id="10" name="image10" descr="Offline listing draft waiting to post"/>
+                    <pic:cNvPicPr/>
+                  </pic:nvPicPr>
+                  <pic:blipFill>
+                    <a:blip r:embed="rId26"/>
+                    <a:stretch>
+                      <a:fillRect/>
+                    </a:stretch>
+                  </pic:blipFill>
+                  <pic:spPr>
+                    <a:xfrm>
+                      <a:off x="0" y="0"/>
+                      <a:ext cx="5486400" cy="3086100"/>
+                    </a:xfrm>
+                    <a:prstGeom prst="rect">
+                      <a:avLst/>
+                    </a:prstGeom>
+                  </pic:spPr>
+                </pic:pic>
+              </a:graphicData>
+            </a:graphic>
+          </wp:inline>
+        </w:drawing>
       </w:r>
     </w:p>
     <w:p>
@@ -12917,7 +13465,7 @@
         <w:t xml:space="preserve">backend/</w:t>
       </w:r>
       <w:r>
-        <w:t xml:space="preserve"> (23 tests in </w:t>
+        <w:t xml:space="preserve"> (48 Jest tests in backend/__tests__/ and </w:t>
       </w:r>
       <w:r>
         <w:rPr>
@@ -13048,7 +13596,7 @@
       <w:r>
         <w:t xml:space="preserve">Source code: </w:t>
       </w:r>
-      <w:hyperlink r:id="rId19" w:history="1">
+      <w:hyperlink r:id="rId27" w:history="1">
         <w:r>
           <w:rPr>
             <w:rStyle w:val="Hyperlink"/>

</xml_diff>

<commit_message>
Update report and slides for the redesigned admin module
- Report: admin module, FR12, AdminLog collection, admin API routes, new
  challenges, tests B24-B27 and TC-20/21, test counts (60 backend, 72 total),
  admin screenshots in Appendix C
- Slides: test counts, admin module, AdminLog, challenges and demo step

Co-Authored-By: Claude Opus 5.5 <noreply@anthropic.com>
Claude-Session: https://claude.ai/code/session_01TkMBnKe3c5H95DS4zcaeu8
</commit_message>
<xml_diff>
--- a/docs/report/ZamMarket_Final_Report.docx
+++ b/docs/report/ZamMarket_Final_Report.docx
@@ -296,7 +296,7 @@
     <w:p>
       <w:pPr/>
       <w:r>
-        <w:t xml:space="preserve">The system was developed in four sprints with React, Redux Toolkit, Node.js, Express, MongoDB and Socket.io. An automated suite of 48 backend tests and 12 voice-parser tests passes, covering tamper detection (including the most recent event), authentication, rating rules and simultaneous writes; verifying a 1,000-block chain takes a few milliseconds. The voice parser handles spoken number words, prices with or without a currency word, bag sizes and the named neighbourhoods. A user usability study and production deployment were not completed at the time of writing. The results show that a lightweight hash chain can give informal traders a verifiable reputation without online payment, which no reviewed platform offers in combination with local discovery and intermittent connectivity.</w:t>
+        <w:t xml:space="preserve">The system was developed in four sprints with React, Redux Toolkit, Node.js, Express, MongoDB and Socket.io. An automated suite of 60 backend tests and 12 voice-parser tests passes, covering tamper detection (including the most recent event), authentication, rating rules, administrator rules and simultaneous writes; verifying a 1,000-block chain takes a few milliseconds. The voice parser handles spoken number words, prices with or without a currency word, bag sizes and the named neighbourhoods. A user usability study and production deployment were not completed at the time of writing. The results show that a lightweight hash chain can give informal traders a verifiable reputation without online payment, which no reviewed platform offers in combination with local discovery and intermittent connectivity.</w:t>
       </w:r>
     </w:p>
     <w:p>
@@ -1495,7 +1495,7 @@
         </w:numPr>
       </w:pPr>
       <w:r>
-        <w:t xml:space="preserve">An administrator panel for statistics, seller verification, suspension and listing removal.</w:t>
+        <w:t xml:space="preserve">An administrator panel with a seller verification queue, a trust-integrity check across all sellers, moderation that requires a reason, and a log of every administrator action.</w:t>
       </w:r>
     </w:p>
     <w:p>
@@ -4335,7 +4335,7 @@
           <w:p>
             <w:pPr/>
             <w:r>
-              <w:t xml:space="preserve">Administrators view statistics, verify sellers, suspend or reactivate users, change roles and remove listings</w:t>
+              <w:t xml:space="preserve">Administrators view statistics, verify each seller once, re-check every seller's trust chain, suspend or reactivate users and remove listings with a recorded reason, change buyer and seller roles, and review a log of every administrator action</w:t>
             </w:r>
           </w:p>
         </w:tc>
@@ -5292,6 +5292,41 @@
             <w:pPr/>
             <w:r>
               <w:t xml:space="preserve">TTL index deletes the code at expiry (10 minutes)</w:t>
+            </w:r>
+          </w:p>
+        </w:tc>
+      </w:tr>
+      <w:tr>
+        <w:tc>
+          <w:tcPr>
+            <w:tcW w:w="3120" w:type="dxa"/>
+          </w:tcPr>
+          <w:p>
+            <w:pPr/>
+            <w:r>
+              <w:t xml:space="preserve">AdminLog</w:t>
+            </w:r>
+          </w:p>
+        </w:tc>
+        <w:tc>
+          <w:tcPr>
+            <w:tcW w:w="3120" w:type="dxa"/>
+          </w:tcPr>
+          <w:p>
+            <w:pPr/>
+            <w:r>
+              <w:t xml:space="preserve">admin, adminName, action (verify, suspend, reactivate, change role, remove listing), targetType, targetId, targetName, detail (reason, max 300)</w:t>
+            </w:r>
+          </w:p>
+        </w:tc>
+        <w:tc>
+          <w:tcPr>
+            <w:tcW w:w="3120" w:type="dxa"/>
+          </w:tcPr>
+          <w:p>
+            <w:pPr/>
+            <w:r>
+              <w:t xml:space="preserve">One document per administrator action; index on createdAt (newest first)</w:t>
             </w:r>
           </w:p>
         </w:tc>
@@ -5711,7 +5746,7 @@
     <w:p>
       <w:pPr/>
       <w:r>
-        <w:t xml:space="preserve">The design serves three user groups through twelve functional and eight non-functional requirements. A layered REST and socket architecture over six MongoDB collections supports them, and two small algorithms carry the project's novelty: a hash chain that makes a seller's history tamper-evident, and a pattern-based parser that turns an English sentence into a listing.</w:t>
+        <w:t xml:space="preserve">The design serves three user groups through twelve functional and eight non-functional requirements. A layered REST and socket architecture over seven MongoDB collections supports them, and two small algorithms carry the project's novelty: a hash chain that makes a seller's history tamper-evident, and a pattern-based parser that turns an English sentence into a listing.</w:t>
       </w:r>
     </w:p>
     <w:p>
@@ -6262,7 +6297,7 @@
         <w:t xml:space="preserve">AdminPage.jsx</w:t>
       </w:r>
       <w:r>
-        <w:t xml:space="preserve">): platform statistics, verification (which appends an ADMIN_VERIFIED block), suspension toggle (which also pauses a suspended seller's listings), role changes and listing removal, which also deletes the listing's photo from Cloudinary.</w:t>
+        <w:t xml:space="preserve">): a mobile-first panel with six tabs. Overview lists what needs attention (sellers awaiting verification, trust records that fail verification, suspended accounts) above the platform statistics. Verify shows each waiting seller's trust score, listings and ratings; verifying appends one ADMIN_VERIFIED block, and a second verification is refused. Integrity re-hashes every seller's chain and compares it with the stored head hash, listing any that fail. Users and Listings support search and filters, suspension (which requires a reason and pauses a suspended seller's listings), buyer and seller role changes, and listing removal (which requires a reason and deletes the photo from Cloudinary); administrator accounts cannot be suspended or demoted from the panel. Every action asks for confirmation and is written to the AdminLog collection with the administrator, target, time and reason, which the Activity tab shows.</w:t>
       </w:r>
     </w:p>
     <w:p>
@@ -6819,18 +6854,18 @@
           <w:p>
             <w:pPr/>
             <w:r>
-              <w:t xml:space="preserve">/api/admin/stats, /api/admin/users</w:t>
-            </w:r>
-          </w:p>
-        </w:tc>
-        <w:tc>
-          <w:tcPr>
-            <w:tcW w:w="2340" w:type="dxa"/>
-          </w:tcPr>
-          <w:p>
-            <w:pPr/>
-            <w:r>
-              <w:t xml:space="preserve">Statistics, users</w:t>
+              <w:t xml:space="preserve">/api/admin/stats, /users, /listings</w:t>
+            </w:r>
+          </w:p>
+        </w:tc>
+        <w:tc>
+          <w:tcPr>
+            <w:tcW w:w="2340" w:type="dxa"/>
+          </w:tcPr>
+          <w:p>
+            <w:pPr/>
+            <w:r>
+              <w:t xml:space="preserve">Statistics; users and listings with search and filters</w:t>
             </w:r>
           </w:p>
         </w:tc>
@@ -6854,6 +6889,144 @@
           <w:p>
             <w:pPr/>
             <w:r>
+              <w:t xml:space="preserve">GET</w:t>
+            </w:r>
+          </w:p>
+        </w:tc>
+        <w:tc>
+          <w:tcPr>
+            <w:tcW w:w="2340" w:type="dxa"/>
+          </w:tcPr>
+          <w:p>
+            <w:pPr/>
+            <w:r>
+              <w:t xml:space="preserve">/api/admin/sellers/pending</w:t>
+            </w:r>
+          </w:p>
+        </w:tc>
+        <w:tc>
+          <w:tcPr>
+            <w:tcW w:w="2340" w:type="dxa"/>
+          </w:tcPr>
+          <w:p>
+            <w:pPr/>
+            <w:r>
+              <w:t xml:space="preserve">Sellers awaiting verification</w:t>
+            </w:r>
+          </w:p>
+        </w:tc>
+        <w:tc>
+          <w:tcPr>
+            <w:tcW w:w="2340" w:type="dxa"/>
+          </w:tcPr>
+          <w:p>
+            <w:pPr/>
+            <w:r>
+              <w:t xml:space="preserve">Administrator</w:t>
+            </w:r>
+          </w:p>
+        </w:tc>
+      </w:tr>
+      <w:tr>
+        <w:tc>
+          <w:tcPr>
+            <w:tcW w:w="2340" w:type="dxa"/>
+          </w:tcPr>
+          <w:p>
+            <w:pPr/>
+            <w:r>
+              <w:t xml:space="preserve">GET</w:t>
+            </w:r>
+          </w:p>
+        </w:tc>
+        <w:tc>
+          <w:tcPr>
+            <w:tcW w:w="2340" w:type="dxa"/>
+          </w:tcPr>
+          <w:p>
+            <w:pPr/>
+            <w:r>
+              <w:t xml:space="preserve">/api/admin/trust-integrity</w:t>
+            </w:r>
+          </w:p>
+        </w:tc>
+        <w:tc>
+          <w:tcPr>
+            <w:tcW w:w="2340" w:type="dxa"/>
+          </w:tcPr>
+          <w:p>
+            <w:pPr/>
+            <w:r>
+              <w:t xml:space="preserve">Re-verify every seller's chain</w:t>
+            </w:r>
+          </w:p>
+        </w:tc>
+        <w:tc>
+          <w:tcPr>
+            <w:tcW w:w="2340" w:type="dxa"/>
+          </w:tcPr>
+          <w:p>
+            <w:pPr/>
+            <w:r>
+              <w:t xml:space="preserve">Administrator</w:t>
+            </w:r>
+          </w:p>
+        </w:tc>
+      </w:tr>
+      <w:tr>
+        <w:tc>
+          <w:tcPr>
+            <w:tcW w:w="2340" w:type="dxa"/>
+          </w:tcPr>
+          <w:p>
+            <w:pPr/>
+            <w:r>
+              <w:t xml:space="preserve">GET</w:t>
+            </w:r>
+          </w:p>
+        </w:tc>
+        <w:tc>
+          <w:tcPr>
+            <w:tcW w:w="2340" w:type="dxa"/>
+          </w:tcPr>
+          <w:p>
+            <w:pPr/>
+            <w:r>
+              <w:t xml:space="preserve">/api/admin/activity</w:t>
+            </w:r>
+          </w:p>
+        </w:tc>
+        <w:tc>
+          <w:tcPr>
+            <w:tcW w:w="2340" w:type="dxa"/>
+          </w:tcPr>
+          <w:p>
+            <w:pPr/>
+            <w:r>
+              <w:t xml:space="preserve">Log of administrator actions</w:t>
+            </w:r>
+          </w:p>
+        </w:tc>
+        <w:tc>
+          <w:tcPr>
+            <w:tcW w:w="2340" w:type="dxa"/>
+          </w:tcPr>
+          <w:p>
+            <w:pPr/>
+            <w:r>
+              <w:t xml:space="preserve">Administrator</w:t>
+            </w:r>
+          </w:p>
+        </w:tc>
+      </w:tr>
+      <w:tr>
+        <w:tc>
+          <w:tcPr>
+            <w:tcW w:w="2340" w:type="dxa"/>
+          </w:tcPr>
+          <w:p>
+            <w:pPr/>
+            <w:r>
               <w:t xml:space="preserve">PUT</w:t>
             </w:r>
           </w:p>
@@ -6876,7 +7049,99 @@
           <w:p>
             <w:pPr/>
             <w:r>
-              <w:t xml:space="preserve">Verify seller</w:t>
+              <w:t xml:space="preserve">Verify seller (once only)</w:t>
+            </w:r>
+          </w:p>
+        </w:tc>
+        <w:tc>
+          <w:tcPr>
+            <w:tcW w:w="2340" w:type="dxa"/>
+          </w:tcPr>
+          <w:p>
+            <w:pPr/>
+            <w:r>
+              <w:t xml:space="preserve">Administrator</w:t>
+            </w:r>
+          </w:p>
+        </w:tc>
+      </w:tr>
+      <w:tr>
+        <w:tc>
+          <w:tcPr>
+            <w:tcW w:w="2340" w:type="dxa"/>
+          </w:tcPr>
+          <w:p>
+            <w:pPr/>
+            <w:r>
+              <w:t xml:space="preserve">PUT</w:t>
+            </w:r>
+          </w:p>
+        </w:tc>
+        <w:tc>
+          <w:tcPr>
+            <w:tcW w:w="2340" w:type="dxa"/>
+          </w:tcPr>
+          <w:p>
+            <w:pPr/>
+            <w:r>
+              <w:t xml:space="preserve">/api/admin/users/:id/suspend, /role</w:t>
+            </w:r>
+          </w:p>
+        </w:tc>
+        <w:tc>
+          <w:tcPr>
+            <w:tcW w:w="2340" w:type="dxa"/>
+          </w:tcPr>
+          <w:p>
+            <w:pPr/>
+            <w:r>
+              <w:t xml:space="preserve">Suspend (reason required) or reactivate; change buyer or seller role</w:t>
+            </w:r>
+          </w:p>
+        </w:tc>
+        <w:tc>
+          <w:tcPr>
+            <w:tcW w:w="2340" w:type="dxa"/>
+          </w:tcPr>
+          <w:p>
+            <w:pPr/>
+            <w:r>
+              <w:t xml:space="preserve">Administrator</w:t>
+            </w:r>
+          </w:p>
+        </w:tc>
+      </w:tr>
+      <w:tr>
+        <w:tc>
+          <w:tcPr>
+            <w:tcW w:w="2340" w:type="dxa"/>
+          </w:tcPr>
+          <w:p>
+            <w:pPr/>
+            <w:r>
+              <w:t xml:space="preserve">DELETE</w:t>
+            </w:r>
+          </w:p>
+        </w:tc>
+        <w:tc>
+          <w:tcPr>
+            <w:tcW w:w="2340" w:type="dxa"/>
+          </w:tcPr>
+          <w:p>
+            <w:pPr/>
+            <w:r>
+              <w:t xml:space="preserve">/api/admin/listings/:id</w:t>
+            </w:r>
+          </w:p>
+        </w:tc>
+        <w:tc>
+          <w:tcPr>
+            <w:tcW w:w="2340" w:type="dxa"/>
+          </w:tcPr>
+          <w:p>
+            <w:pPr/>
+            <w:r>
+              <w:t xml:space="preserve">Remove listing (reason required)</w:t>
             </w:r>
           </w:p>
         </w:tc>
@@ -7286,6 +7551,78 @@
           <w:p>
             <w:pPr/>
             <w:r>
+              <w:t xml:space="preserve">Verifying a seller twice added a second +15 block, so an administrator could inflate a score by repeated clicks</w:t>
+            </w:r>
+          </w:p>
+        </w:tc>
+        <w:tc>
+          <w:tcPr>
+            <w:tcW w:w="4680" w:type="dxa"/>
+          </w:tcPr>
+          <w:p>
+            <w:pPr/>
+            <w:r>
+              <w:t xml:space="preserve">Verification is refused (409) once a seller is verified, and suspended sellers cannot be verified</w:t>
+            </w:r>
+          </w:p>
+        </w:tc>
+      </w:tr>
+      <w:tr>
+        <w:tc>
+          <w:tcPr>
+            <w:tcW w:w="4680" w:type="dxa"/>
+          </w:tcPr>
+          <w:p>
+            <w:pPr/>
+            <w:r>
+              <w:t xml:space="preserve">An administrator could demote or suspend another administrator, and actions left no record</w:t>
+            </w:r>
+          </w:p>
+        </w:tc>
+        <w:tc>
+          <w:tcPr>
+            <w:tcW w:w="4680" w:type="dxa"/>
+          </w:tcPr>
+          <w:p>
+            <w:pPr/>
+            <w:r>
+              <w:t xml:space="preserve">Administrator accounts are protected in the panel; suspensions and removals require a reason; every action is written to the AdminLog collection</w:t>
+            </w:r>
+          </w:p>
+        </w:tc>
+      </w:tr>
+      <w:tr>
+        <w:tc>
+          <w:tcPr>
+            <w:tcW w:w="4680" w:type="dxa"/>
+          </w:tcPr>
+          <w:p>
+            <w:pPr/>
+            <w:r>
+              <w:t xml:space="preserve">Tampering was visible only when someone opened that seller's trust page</w:t>
+            </w:r>
+          </w:p>
+        </w:tc>
+        <w:tc>
+          <w:tcPr>
+            <w:tcW w:w="4680" w:type="dxa"/>
+          </w:tcPr>
+          <w:p>
+            <w:pPr/>
+            <w:r>
+              <w:t xml:space="preserve">Integrity check in the admin panel re-verifies every seller's chain at once and lists the ones that fail</w:t>
+            </w:r>
+          </w:p>
+        </w:tc>
+      </w:tr>
+      <w:tr>
+        <w:tc>
+          <w:tcPr>
+            <w:tcW w:w="4680" w:type="dxa"/>
+          </w:tcPr>
+          <w:p>
+            <w:pPr/>
+            <w:r>
               <w:t xml:space="preserve">Buyers viewing their own profile were treated as sellers</w:t>
             </w:r>
           </w:p>
@@ -7534,7 +7871,7 @@
           <w:p>
             <w:pPr/>
             <w:r>
-              <w:t xml:space="preserve">All backend tests run under Jest: 48 tests</w:t>
+              <w:t xml:space="preserve">All backend tests run under Jest: 60 tests</w:t>
             </w:r>
           </w:p>
         </w:tc>
@@ -7587,7 +7924,7 @@
     <w:p>
       <w:pPr/>
       <w:r>
-        <w:t xml:space="preserve">The automated test suite passes in full: 48 backend tests and 12 voice-parser tests. System tests of each user story and the usability study are reported below; where a test has not yet been run, its result is left blank rather than assumed. This chapter sets out the strategy, the results, their analysis and an evaluation against each objective.</w:t>
+        <w:t xml:space="preserve">The automated test suite passes in full: 60 backend tests and 12 voice-parser tests. System tests of each user story and the usability study are reported below; where a test has not yet been run, its result is left blank rather than assumed. This chapter sets out the strategy, the results, their analysis and an evaluation against each objective.</w:t>
       </w:r>
     </w:p>
     <w:p>
@@ -7631,7 +7968,7 @@
         <w:t xml:space="preserve">backend/</w:t>
       </w:r>
       <w:r>
-        <w:t xml:space="preserve"> runs 48 Jest tests: the trust chain and block creation, authentication middleware, registration, the User model (phone validation, password checks, phone masking), rating rules, simultaneous trust events, allowed origins, upload errors and search escaping. Database models are replaced by stubs, so no database is needed. </w:t>
+        <w:t xml:space="preserve"> runs 60 Jest tests: the trust chain and block creation, authentication middleware, registration, the User model (phone validation, password checks, phone masking), rating rules, simultaneous trust events, allowed origins, upload errors, search escaping and the administrator rules. Database models are replaced by stubs, so no database is needed. </w:t>
       </w:r>
       <w:r>
         <w:rPr>
@@ -9164,11 +9501,239 @@
           </w:p>
         </w:tc>
       </w:tr>
+      <w:tr>
+        <w:tc>
+          <w:tcPr>
+            <w:tcW w:w="1872" w:type="dxa"/>
+          </w:tcPr>
+          <w:p>
+            <w:pPr/>
+            <w:r>
+              <w:t xml:space="preserve">B24</w:t>
+            </w:r>
+          </w:p>
+        </w:tc>
+        <w:tc>
+          <w:tcPr>
+            <w:tcW w:w="1872" w:type="dxa"/>
+          </w:tcPr>
+          <w:p>
+            <w:pPr/>
+            <w:r>
+              <w:t xml:space="preserve">Admin</w:t>
+            </w:r>
+          </w:p>
+        </w:tc>
+        <w:tc>
+          <w:tcPr>
+            <w:tcW w:w="1872" w:type="dxa"/>
+          </w:tcPr>
+          <w:p>
+            <w:pPr/>
+            <w:r>
+              <w:t xml:space="preserve">Verify a seller; verify again; verify a suspended seller</w:t>
+            </w:r>
+          </w:p>
+        </w:tc>
+        <w:tc>
+          <w:tcPr>
+            <w:tcW w:w="1872" w:type="dxa"/>
+          </w:tcPr>
+          <w:p>
+            <w:pPr/>
+            <w:r>
+              <w:t xml:space="preserve">One ADMIN_VERIFIED block and one log entry; then 409 with no new block; 400</w:t>
+            </w:r>
+          </w:p>
+        </w:tc>
+        <w:tc>
+          <w:tcPr>
+            <w:tcW w:w="1872" w:type="dxa"/>
+          </w:tcPr>
+          <w:p>
+            <w:pPr/>
+            <w:r>
+              <w:t xml:space="preserve">Pass</w:t>
+            </w:r>
+          </w:p>
+        </w:tc>
+      </w:tr>
+      <w:tr>
+        <w:tc>
+          <w:tcPr>
+            <w:tcW w:w="1872" w:type="dxa"/>
+          </w:tcPr>
+          <w:p>
+            <w:pPr/>
+            <w:r>
+              <w:t xml:space="preserve">B25</w:t>
+            </w:r>
+          </w:p>
+        </w:tc>
+        <w:tc>
+          <w:tcPr>
+            <w:tcW w:w="1872" w:type="dxa"/>
+          </w:tcPr>
+          <w:p>
+            <w:pPr/>
+            <w:r>
+              <w:t xml:space="preserve">Admin</w:t>
+            </w:r>
+          </w:p>
+        </w:tc>
+        <w:tc>
+          <w:tcPr>
+            <w:tcW w:w="1872" w:type="dxa"/>
+          </w:tcPr>
+          <w:p>
+            <w:pPr/>
+            <w:r>
+              <w:t xml:space="preserve">Suspend without a reason; with a reason; reactivate; suspend an administrator</w:t>
+            </w:r>
+          </w:p>
+        </w:tc>
+        <w:tc>
+          <w:tcPr>
+            <w:tcW w:w="1872" w:type="dxa"/>
+          </w:tcPr>
+          <w:p>
+            <w:pPr/>
+            <w:r>
+              <w:t xml:space="preserve">400; seller's listings paused and reason logged; allowed without reason; 403</w:t>
+            </w:r>
+          </w:p>
+        </w:tc>
+        <w:tc>
+          <w:tcPr>
+            <w:tcW w:w="1872" w:type="dxa"/>
+          </w:tcPr>
+          <w:p>
+            <w:pPr/>
+            <w:r>
+              <w:t xml:space="preserve">Pass</w:t>
+            </w:r>
+          </w:p>
+        </w:tc>
+      </w:tr>
+      <w:tr>
+        <w:tc>
+          <w:tcPr>
+            <w:tcW w:w="1872" w:type="dxa"/>
+          </w:tcPr>
+          <w:p>
+            <w:pPr/>
+            <w:r>
+              <w:t xml:space="preserve">B26</w:t>
+            </w:r>
+          </w:p>
+        </w:tc>
+        <w:tc>
+          <w:tcPr>
+            <w:tcW w:w="1872" w:type="dxa"/>
+          </w:tcPr>
+          <w:p>
+            <w:pPr/>
+            <w:r>
+              <w:t xml:space="preserve">Admin</w:t>
+            </w:r>
+          </w:p>
+        </w:tc>
+        <w:tc>
+          <w:tcPr>
+            <w:tcW w:w="1872" w:type="dxa"/>
+          </w:tcPr>
+          <w:p>
+            <w:pPr/>
+            <w:r>
+              <w:t xml:space="preserve">Change an administrator's role; assign "admin"; buyer to seller</w:t>
+            </w:r>
+          </w:p>
+        </w:tc>
+        <w:tc>
+          <w:tcPr>
+            <w:tcW w:w="1872" w:type="dxa"/>
+          </w:tcPr>
+          <w:p>
+            <w:pPr/>
+            <w:r>
+              <w:t xml:space="preserve">403; 400; changed and logged as "buyer → seller"</w:t>
+            </w:r>
+          </w:p>
+        </w:tc>
+        <w:tc>
+          <w:tcPr>
+            <w:tcW w:w="1872" w:type="dxa"/>
+          </w:tcPr>
+          <w:p>
+            <w:pPr/>
+            <w:r>
+              <w:t xml:space="preserve">Pass</w:t>
+            </w:r>
+          </w:p>
+        </w:tc>
+      </w:tr>
+      <w:tr>
+        <w:tc>
+          <w:tcPr>
+            <w:tcW w:w="1872" w:type="dxa"/>
+          </w:tcPr>
+          <w:p>
+            <w:pPr/>
+            <w:r>
+              <w:t xml:space="preserve">B27</w:t>
+            </w:r>
+          </w:p>
+        </w:tc>
+        <w:tc>
+          <w:tcPr>
+            <w:tcW w:w="1872" w:type="dxa"/>
+          </w:tcPr>
+          <w:p>
+            <w:pPr/>
+            <w:r>
+              <w:t xml:space="preserve">Admin</w:t>
+            </w:r>
+          </w:p>
+        </w:tc>
+        <w:tc>
+          <w:tcPr>
+            <w:tcW w:w="1872" w:type="dxa"/>
+          </w:tcPr>
+          <w:p>
+            <w:pPr/>
+            <w:r>
+              <w:t xml:space="preserve">Remove a listing without a reason; integrity check with one edited chain among two sellers</w:t>
+            </w:r>
+          </w:p>
+        </w:tc>
+        <w:tc>
+          <w:tcPr>
+            <w:tcW w:w="1872" w:type="dxa"/>
+          </w:tcPr>
+          <w:p>
+            <w:pPr/>
+            <w:r>
+              <w:t xml:space="preserve">400; only the edited seller flagged</w:t>
+            </w:r>
+          </w:p>
+        </w:tc>
+        <w:tc>
+          <w:tcPr>
+            <w:tcW w:w="1872" w:type="dxa"/>
+          </w:tcPr>
+          <w:p>
+            <w:pPr/>
+            <w:r>
+              <w:t xml:space="preserve">Pass</w:t>
+            </w:r>
+          </w:p>
+        </w:tc>
+      </w:tr>
     </w:tbl>
     <w:p>
       <w:pPr/>
       <w:r>
-        <w:t xml:space="preserve">A further 25 tests, in backend/__tests__ and for upload errors, cover block creation, the User model (phone validation, password checks and phone masking) and photo-upload error messages. Test B17 shows why the head hash was added. Checking links alone cannot detect an edit to the most recent block, because no later block points to it; comparing that block with the hash saved on the seller's account catches the edit.</w:t>
+        <w:t xml:space="preserve">Rows B24 to B27 group the 12 administrator tests. A further 25 tests, in backend/__tests__ and for upload errors, cover block creation, the User model (phone validation, password checks and phone masking) and photo-upload error messages. Test B17 shows why the head hash was added. Checking links alone cannot detect an edit to the most recent block, because no later block points to it; comparing that block with the hash saved on the seller's account catches the edit.</w:t>
       </w:r>
     </w:p>
     <w:p>
@@ -10595,18 +11160,18 @@
           <w:p>
             <w:pPr/>
             <w:r>
-              <w:t xml:space="preserve">Admin verifies a seller</w:t>
-            </w:r>
-          </w:p>
-        </w:tc>
-        <w:tc>
-          <w:tcPr>
-            <w:tcW w:w="2340" w:type="dxa"/>
-          </w:tcPr>
-          <w:p>
-            <w:pPr/>
-            <w:r>
-              <w:t xml:space="preserve">Badge shown; score +15</w:t>
+              <w:t xml:space="preserve">Admin verifies a seller from the Verify tab</w:t>
+            </w:r>
+          </w:p>
+        </w:tc>
+        <w:tc>
+          <w:tcPr>
+            <w:tcW w:w="2340" w:type="dxa"/>
+          </w:tcPr>
+          <w:p>
+            <w:pPr/>
+            <w:r>
+              <w:t xml:space="preserve">Badge shown; score +15; seller leaves the queue</w:t>
             </w:r>
           </w:p>
         </w:tc>
@@ -10846,6 +11411,98 @@
             <w:pPr/>
             <w:r>
               <w:t xml:space="preserve">Photo shrunk on the phone; listing created</w:t>
+            </w:r>
+          </w:p>
+        </w:tc>
+        <w:tc>
+          <w:tcPr>
+            <w:tcW w:w="2340" w:type="dxa"/>
+          </w:tcPr>
+          <w:p>
+            <w:pPr/>
+            <w:r>
+              <w:t xml:space="preserve">[Pass/Fail]</w:t>
+            </w:r>
+          </w:p>
+        </w:tc>
+      </w:tr>
+      <w:tr>
+        <w:tc>
+          <w:tcPr>
+            <w:tcW w:w="2340" w:type="dxa"/>
+          </w:tcPr>
+          <w:p>
+            <w:pPr/>
+            <w:r>
+              <w:t xml:space="preserve">TC-20</w:t>
+            </w:r>
+          </w:p>
+        </w:tc>
+        <w:tc>
+          <w:tcPr>
+            <w:tcW w:w="2340" w:type="dxa"/>
+          </w:tcPr>
+          <w:p>
+            <w:pPr/>
+            <w:r>
+              <w:t xml:space="preserve">After TC-12, admin opens the Integrity tab</w:t>
+            </w:r>
+          </w:p>
+        </w:tc>
+        <w:tc>
+          <w:tcPr>
+            <w:tcW w:w="2340" w:type="dxa"/>
+          </w:tcPr>
+          <w:p>
+            <w:pPr/>
+            <w:r>
+              <w:t xml:space="preserve">That seller listed as failing verification; badge on the tab</w:t>
+            </w:r>
+          </w:p>
+        </w:tc>
+        <w:tc>
+          <w:tcPr>
+            <w:tcW w:w="2340" w:type="dxa"/>
+          </w:tcPr>
+          <w:p>
+            <w:pPr/>
+            <w:r>
+              <w:t xml:space="preserve">[Pass/Fail]</w:t>
+            </w:r>
+          </w:p>
+        </w:tc>
+      </w:tr>
+      <w:tr>
+        <w:tc>
+          <w:tcPr>
+            <w:tcW w:w="2340" w:type="dxa"/>
+          </w:tcPr>
+          <w:p>
+            <w:pPr/>
+            <w:r>
+              <w:t xml:space="preserve">TC-21</w:t>
+            </w:r>
+          </w:p>
+        </w:tc>
+        <w:tc>
+          <w:tcPr>
+            <w:tcW w:w="2340" w:type="dxa"/>
+          </w:tcPr>
+          <w:p>
+            <w:pPr/>
+            <w:r>
+              <w:t xml:space="preserve">Admin suspends a seller, giving a reason</w:t>
+            </w:r>
+          </w:p>
+        </w:tc>
+        <w:tc>
+          <w:tcPr>
+            <w:tcW w:w="2340" w:type="dxa"/>
+          </w:tcPr>
+          <w:p>
+            <w:pPr/>
+            <w:r>
+              <w:t xml:space="preserve">Seller's listings paused; entry with the reason in the Activity tab</w:t>
             </w:r>
           </w:p>
         </w:tc>
@@ -11075,7 +11732,7 @@
           <w:p>
             <w:pPr/>
             <w:r>
-              <w:t xml:space="preserve">48 of 48 backend tests pass, including the head-hash check and per-conversation rating</w:t>
+              <w:t xml:space="preserve">60 of 60 backend tests pass, including the head-hash check and per-conversation rating</w:t>
             </w:r>
           </w:p>
         </w:tc>
@@ -11561,7 +12218,7 @@
     <w:p>
       <w:pPr/>
       <w:r>
-        <w:t xml:space="preserve">Informal charcoal sellers in Lusaka lack a way to reach nearby buyers, and buyers lack a way to judge sellers they have not met. Existing platforms offer either local discovery without trust or trust that depends on online payment. Over four agile sprints and a stabilisation period, this project built ZamMarket, a mobile-first PWA with neighbourhood-based discovery, English voice-based listing creation, real-time chat with offline queuing, and a seller trust score backed by a SHA-256 hash chain with conversation-gated ratings. Unit tests confirmed that the chain detects edited, deleted and reordered history and verifies 1,000 blocks in a few milliseconds. An automated suite of 60 tests, run on every push, confirms the trust chain (including the most recent event), the rating rules and the voice parser. Usability testing and redeployment remain outstanding.</w:t>
+        <w:t xml:space="preserve">Informal charcoal sellers in Lusaka lack a way to reach nearby buyers, and buyers lack a way to judge sellers they have not met. Existing platforms offer either local discovery without trust or trust that depends on online payment. Over four agile sprints and a stabilisation period, this project built ZamMarket, a mobile-first PWA with neighbourhood-based discovery, English voice-based listing creation, real-time chat with offline queuing, and a seller trust score backed by a SHA-256 hash chain with conversation-gated ratings. Unit tests confirmed that the chain detects edited, deleted and reordered history and verifies 1,000 blocks in a few milliseconds. An automated suite of 72 tests, run on every push, confirms the trust chain (including the most recent event), the rating rules and the voice parser. Usability testing and redeployment remain outstanding.</w:t>
       </w:r>
     </w:p>
     <w:p>
@@ -13268,6 +13925,96 @@
       </w:r>
     </w:p>
     <w:p>
+      <w:pPr/>
+      <w:r>
+        <w:rPr>
+          <w:b/>
+        </w:rPr>
+        <w:t xml:space="preserve">Figure C.9: Administrator overview: items needing attention, statistics and recent actions</w:t>
+      </w:r>
+    </w:p>
+    <w:p>
+      <w:pPr/>
+      <w:r>
+        <w:drawing>
+          <wp:inline distT="0" distB="0" distL="0" distR="0">
+            <wp:extent cx="5486400" cy="2914650"/>
+            <wp:docPr id="11" name="image11" descr="Admin overview"/>
+            <a:graphic xmlns:a="http://schemas.openxmlformats.org/drawingml/2006/main">
+              <a:graphicData uri="http://schemas.openxmlformats.org/drawingml/2006/picture">
+                <pic:pic xmlns:pic="http://schemas.openxmlformats.org/drawingml/2006/picture">
+                  <pic:nvPicPr>
+                    <pic:cNvPr id="11" name="image11" descr="Admin overview"/>
+                    <pic:cNvPicPr/>
+                  </pic:nvPicPr>
+                  <pic:blipFill>
+                    <a:blip r:embed="rId27"/>
+                    <a:stretch>
+                      <a:fillRect/>
+                    </a:stretch>
+                  </pic:blipFill>
+                  <pic:spPr>
+                    <a:xfrm>
+                      <a:off x="0" y="0"/>
+                      <a:ext cx="5486400" cy="2914650"/>
+                    </a:xfrm>
+                    <a:prstGeom prst="rect">
+                      <a:avLst/>
+                    </a:prstGeom>
+                  </pic:spPr>
+                </pic:pic>
+              </a:graphicData>
+            </a:graphic>
+          </wp:inline>
+        </w:drawing>
+      </w:r>
+    </w:p>
+    <w:p>
+      <w:pPr/>
+      <w:r>
+        <w:rPr>
+          <w:b/>
+        </w:rPr>
+        <w:t xml:space="preserve">Figure C.10: Seller verification queue on a phone</w:t>
+      </w:r>
+    </w:p>
+    <w:p>
+      <w:pPr/>
+      <w:r>
+        <w:drawing>
+          <wp:inline distT="0" distB="0" distL="0" distR="0">
+            <wp:extent cx="4397370" cy="7498080"/>
+            <wp:docPr id="12" name="image12" descr="Admin verification queue"/>
+            <a:graphic xmlns:a="http://schemas.openxmlformats.org/drawingml/2006/main">
+              <a:graphicData uri="http://schemas.openxmlformats.org/drawingml/2006/picture">
+                <pic:pic xmlns:pic="http://schemas.openxmlformats.org/drawingml/2006/picture">
+                  <pic:nvPicPr>
+                    <pic:cNvPr id="12" name="image12" descr="Admin verification queue"/>
+                    <pic:cNvPicPr/>
+                  </pic:nvPicPr>
+                  <pic:blipFill>
+                    <a:blip r:embed="rId28"/>
+                    <a:stretch>
+                      <a:fillRect/>
+                    </a:stretch>
+                  </pic:blipFill>
+                  <pic:spPr>
+                    <a:xfrm>
+                      <a:off x="0" y="0"/>
+                      <a:ext cx="4397370" cy="7498080"/>
+                    </a:xfrm>
+                    <a:prstGeom prst="rect">
+                      <a:avLst/>
+                    </a:prstGeom>
+                  </pic:spPr>
+                </pic:pic>
+              </a:graphicData>
+            </a:graphic>
+          </wp:inline>
+        </w:drawing>
+      </w:r>
+    </w:p>
+    <w:p>
       <w:pPr>
         <w:pStyle w:val="Heading2"/>
       </w:pPr>
@@ -13465,7 +14212,7 @@
         <w:t xml:space="preserve">backend/</w:t>
       </w:r>
       <w:r>
-        <w:t xml:space="preserve"> (48 Jest tests in backend/__tests__/ and </w:t>
+        <w:t xml:space="preserve"> (60 Jest tests in backend/__tests__/ and </w:t>
       </w:r>
       <w:r>
         <w:rPr>
@@ -13596,7 +14343,7 @@
       <w:r>
         <w:t xml:space="preserve">Source code: </w:t>
       </w:r>
-      <w:hyperlink r:id="rId27" w:history="1">
+      <w:hyperlink r:id="rId29" w:history="1">
         <w:r>
           <w:rPr>
             <w:rStyle w:val="Hyperlink"/>

</xml_diff>

<commit_message>
Report and slides: live deployment, phone test results, 15-minute deck
- Report: deployed on 12 October 2026 (abstract, limitations, conclusion,
  Appendix B hosting steps), system tests TC-01/04/06/07/14/16/17 passed on
  the live system plus TC-22 (install on Android), SMS module described,
  new challenges (OTP in production, phone formats, neighbourhood lists,
  install icons), test counts 73 backend + 13 voice = 86
- Slides: same updates; new ZamMarket_Presentation_15min.pptx with 15 of
  the 48 slides for the 15-minute slot

Co-Authored-By: Claude Opus 5.5 <noreply@anthropic.com>
Claude-Session: https://claude.ai/code/session_01TkMBnKe3c5H95DS4zcaeu8
</commit_message>
<xml_diff>
--- a/docs/report/ZamMarket_Final_Report.docx
+++ b/docs/report/ZamMarket_Final_Report.docx
@@ -296,7 +296,7 @@
     <w:p>
       <w:pPr/>
       <w:r>
-        <w:t xml:space="preserve">The system was developed in four sprints with React, Redux Toolkit, Node.js, Express, MongoDB and Socket.io. An automated suite of 60 backend tests and 12 voice-parser tests passes, covering tamper detection (including the most recent event), authentication, rating rules, administrator rules and simultaneous writes; verifying a 1,000-block chain takes a few milliseconds. The voice parser handles spoken number words, prices with or without a currency word, bag sizes and the named neighbourhoods. A user usability study and production deployment were not completed at the time of writing. The results show that a lightweight hash chain can give informal traders a verifiable reputation without online payment, which no reviewed platform offers in combination with local discovery and intermittent connectivity.</w:t>
+        <w:t xml:space="preserve">The system was developed in four sprints with React, Redux Toolkit, Node.js, Express, MongoDB and Socket.io. An automated suite of 73 backend tests and 13 voice-parser tests passes, covering tamper detection (including the most recent event), authentication, rating rules, administrator rules and simultaneous writes; verifying a 1,000-block chain takes a few milliseconds. The voice parser handles spoken number words, prices with or without a currency word, bag sizes and the named neighbourhoods. The system is deployed on Vercel and Render (https://zam-market-khaki.vercel.app) and was tested end to end on an Android phone; a user usability study was not completed at the time of writing. The results show that a lightweight hash chain can give informal traders a verifiable reputation without online payment, which no reviewed platform offers in combination with local discovery and intermittent connectivity.</w:t>
       </w:r>
     </w:p>
     <w:p>
@@ -1551,7 +1551,7 @@
         </w:numPr>
       </w:pPr>
       <w:r>
-        <w:t xml:space="preserve">Real SMS delivery of OTP codes (simulated in development).</w:t>
+        <w:t xml:space="preserve">Paid SMS delivery of OTP codes: sending through Africa's Talking or Twilio is built in but switched off, and codes are written to the server log.</w:t>
       </w:r>
     </w:p>
     <w:p>
@@ -1651,7 +1651,7 @@
         <w:t xml:space="preserve">Deployment.</w:t>
       </w:r>
       <w:r>
-        <w:t xml:space="preserve"> Attempts to deploy the system to Vercel and Render in July and September 2026 were unsuccessful, so evaluation was carried out on a local installation. The causes were later found and fixed in the code (Section 5.6), but a successful redeployment had not been completed at the time of writing.</w:t>
+        <w:t xml:space="preserve"> Attempts to deploy the system to Vercel and Render in July and September 2026 were unsuccessful, so most evaluation was carried out on a local installation. The causes were found and fixed (Section 5.6), and the system was deployed successfully on 12 October 2026. The free Render plan sleeps when idle, so the first request after a pause can take up to a minute.</w:t>
       </w:r>
     </w:p>
     <w:p>
@@ -1666,10 +1666,10 @@
         <w:rPr>
           <w:b/>
         </w:rPr>
-        <w:t xml:space="preserve">Simulated OTP.</w:t>
-      </w:r>
-      <w:r>
-        <w:t xml:space="preserve"> Codes are printed to the server console rather than sent by SMS.</w:t>
+        <w:t xml:space="preserve">No paid SMS.</w:t>
+      </w:r>
+      <w:r>
+        <w:t xml:space="preserve"> SMS costs money with every provider, so the deployed system writes registration codes to the server log; real SMS through Africa's Talking or Twilio is implemented and tested, and is switched on with one setting.</w:t>
       </w:r>
     </w:p>
     <w:p>
@@ -2119,7 +2119,7 @@
           <w:p>
             <w:pPr/>
             <w:r>
-              <w:t xml:space="preserve">Working prototype, run locally; production deployment not yet successful</w:t>
+              <w:t xml:space="preserve">Working prototype, deployed on Vercel and Render (October 2026)</w:t>
             </w:r>
           </w:p>
         </w:tc>
@@ -5955,7 +5955,7 @@
         <w:t xml:space="preserve">auth.js</w:t>
       </w:r>
       <w:r>
-        <w:t xml:space="preserve"> middleware): two-step registration in which a 6-digit OTP is generated, stored with a 10-minute TTL and printed to the server console, then checked with a three-attempt limit before the account is created. Login returns a JWT; </w:t>
+        <w:t xml:space="preserve"> middleware): two-step registration in which a 6-digit OTP is generated, stored with a 10-minute TTL and delivered through a small SMS module (sms.js) whose provider is chosen with one setting: the server log (the default, used in the deployed system), Africa's Talking or Twilio. A phone can request one code per minute, a code that fails to send is deleted, and numbers are stored in one form (+260). The code is then checked with a three-attempt limit before the account is created. Login returns a JWT; </w:t>
       </w:r>
       <w:r>
         <w:rPr>
@@ -7790,7 +7790,112 @@
               <w:t xml:space="preserve">localhost</w:t>
             </w:r>
             <w:r>
-              <w:t xml:space="preserve"> origins; the service worker pre-cached development-only files; and refreshing a page on Vercel returned 404</w:t>
+              <w:t xml:space="preserve"> origins; the service worker pre-cached development-only files; and refreshing a page on Vercel returned 404. Deployed successfully on 12 October 2026</w:t>
+            </w:r>
+          </w:p>
+        </w:tc>
+      </w:tr>
+      <w:tr>
+        <w:tc>
+          <w:tcPr>
+            <w:tcW w:w="4680" w:type="dxa"/>
+          </w:tcPr>
+          <w:p>
+            <w:pPr/>
+            <w:r>
+              <w:t xml:space="preserve">In production the OTP code was neither sent nor logged, so nobody could register on the hosted system</w:t>
+            </w:r>
+          </w:p>
+        </w:tc>
+        <w:tc>
+          <w:tcPr>
+            <w:tcW w:w="4680" w:type="dxa"/>
+          </w:tcPr>
+          <w:p>
+            <w:pPr/>
+            <w:r>
+              <w:t xml:space="preserve">SMS gateway module with a one-setting choice of provider (</w:t>
+            </w:r>
+            <w:r>
+              <w:rPr>
+                <w:rStyle w:val="CodeChar"/>
+              </w:rPr>
+              <w:t xml:space="preserve">SMS_PROVIDER</w:t>
+            </w:r>
+            <w:r>
+              <w:t xml:space="preserve">: console, Africa's Talking or Twilio); the console option writes the code to the server log, which works in production at no cost</w:t>
+            </w:r>
+          </w:p>
+        </w:tc>
+      </w:tr>
+      <w:tr>
+        <w:tc>
+          <w:tcPr>
+            <w:tcW w:w="4680" w:type="dxa"/>
+          </w:tcPr>
+          <w:p>
+            <w:pPr/>
+            <w:r>
+              <w:t xml:space="preserve">Accounts created in the app could not log in when the number was typed as 0977… instead of +260977…</w:t>
+            </w:r>
+          </w:p>
+        </w:tc>
+        <w:tc>
+          <w:tcPr>
+            <w:tcW w:w="4680" w:type="dxa"/>
+          </w:tcPr>
+          <w:p>
+            <w:pPr/>
+            <w:r>
+              <w:t xml:space="preserve">Numbers are stored in one form (+260) and login accepts either form</w:t>
+            </w:r>
+          </w:p>
+        </w:tc>
+      </w:tr>
+      <w:tr>
+        <w:tc>
+          <w:tcPr>
+            <w:tcW w:w="4680" w:type="dxa"/>
+          </w:tcPr>
+          <w:p>
+            <w:pPr/>
+            <w:r>
+              <w:t xml:space="preserve">After new neighbourhoods were added, the backend, the form and the voice parser held different lists, so some listings were rejected</w:t>
+            </w:r>
+          </w:p>
+        </w:tc>
+        <w:tc>
+          <w:tcPr>
+            <w:tcW w:w="4680" w:type="dxa"/>
+          </w:tcPr>
+          <w:p>
+            <w:pPr/>
+            <w:r>
+              <w:t xml:space="preserve">One list in all three places, with a test that fails if they ever differ</w:t>
+            </w:r>
+          </w:p>
+        </w:tc>
+      </w:tr>
+      <w:tr>
+        <w:tc>
+          <w:tcPr>
+            <w:tcW w:w="4680" w:type="dxa"/>
+          </w:tcPr>
+          <w:p>
+            <w:pPr/>
+            <w:r>
+              <w:t xml:space="preserve">Chrome on Android did not offer to install the app</w:t>
+            </w:r>
+          </w:p>
+        </w:tc>
+        <w:tc>
+          <w:tcPr>
+            <w:tcW w:w="4680" w:type="dxa"/>
+          </w:tcPr>
+          <w:p>
+            <w:pPr/>
+            <w:r>
+              <w:t xml:space="preserve">Added 192 and 512 pixel PNG icons to the manifest; Android does not accept an SVG-only icon</w:t>
             </w:r>
           </w:p>
         </w:tc>
@@ -7871,7 +7976,7 @@
           <w:p>
             <w:pPr/>
             <w:r>
-              <w:t xml:space="preserve">All backend tests run under Jest: 60 tests</w:t>
+              <w:t xml:space="preserve">All backend tests run under Jest: 73 tests</w:t>
             </w:r>
           </w:p>
         </w:tc>
@@ -7902,7 +8007,7 @@
     <w:p>
       <w:pPr/>
       <w:r>
-        <w:t xml:space="preserve">Eight modules were implemented across a REST and socket backend and a React PWA. The trust module is the most distinctive: a few dozen lines of hashing code, reached from every place that changes a seller's reputation. The main open task is to redeploy with the fixes in Section 5.6 and confirm the hosted system works end to end.</w:t>
+        <w:t xml:space="preserve">Eight modules were implemented across a REST and socket backend and a React PWA. The trust module is the most distinctive: a few dozen lines of hashing code, reached from every place that changes a seller's reputation. With the fixes in Section 5.6 the system was deployed and works end to end on the hosted services.</w:t>
       </w:r>
     </w:p>
     <w:p>
@@ -7924,7 +8029,7 @@
     <w:p>
       <w:pPr/>
       <w:r>
-        <w:t xml:space="preserve">The automated test suite passes in full: 60 backend tests and 12 voice-parser tests. System tests of each user story and the usability study are reported below; where a test has not yet been run, its result is left blank rather than assumed. This chapter sets out the strategy, the results, their analysis and an evaluation against each objective.</w:t>
+        <w:t xml:space="preserve">The automated test suite passes in full: 73 backend tests and 13 voice-parser tests. System tests of each user story and the usability study are reported below; where a test has not yet been run, its result is left blank rather than assumed. This chapter sets out the strategy, the results, their analysis and an evaluation against each objective.</w:t>
       </w:r>
     </w:p>
     <w:p>
@@ -7968,7 +8073,7 @@
         <w:t xml:space="preserve">backend/</w:t>
       </w:r>
       <w:r>
-        <w:t xml:space="preserve"> runs 60 Jest tests: the trust chain and block creation, authentication middleware, registration, the User model (phone validation, password checks, phone masking), rating rules, simultaneous trust events, allowed origins, upload errors, search escaping and the administrator rules. Database models are replaced by stubs, so no database is needed. </w:t>
+        <w:t xml:space="preserve"> runs 73 Jest tests: the trust chain and block creation, authentication middleware, registration, the User model (phone validation, password checks, phone masking), rating rules, simultaneous trust events, allowed origins, upload errors, search escaping, the administrator rules, SMS sending (with the gateways stubbed) and phone-number handling. Database models are replaced by stubs, so no database is needed. </w:t>
       </w:r>
       <w:r>
         <w:rPr>
@@ -7986,7 +8091,7 @@
         <w:t xml:space="preserve">frontend/</w:t>
       </w:r>
       <w:r>
-        <w:t xml:space="preserve"> runs 12 tests of the voice parser. The frontend is also linted and built on every push.</w:t>
+        <w:t xml:space="preserve"> runs 13 tests of the voice parser, including one that checks the parser, the listing form and the backend use the same neighbourhood list. The frontend is also linted and built on every push.</w:t>
       </w:r>
     </w:p>
     <w:p>
@@ -10459,7 +10564,7 @@
     <w:p>
       <w:pPr/>
       <w:r>
-        <w:t xml:space="preserve">Rows group the cases of the 12 automated parser tests.</w:t>
+        <w:t xml:space="preserve">Rows group the cases of the 13 automated parser tests.</w:t>
       </w:r>
     </w:p>
     <w:p>
@@ -10584,6 +10689,52 @@
           <w:p>
             <w:pPr/>
             <w:r>
+              <w:t xml:space="preserve">Pass (hosted; code read from the server log)</w:t>
+            </w:r>
+          </w:p>
+        </w:tc>
+      </w:tr>
+      <w:tr>
+        <w:tc>
+          <w:tcPr>
+            <w:tcW w:w="2340" w:type="dxa"/>
+          </w:tcPr>
+          <w:p>
+            <w:pPr/>
+            <w:r>
+              <w:t xml:space="preserve">TC-02</w:t>
+            </w:r>
+          </w:p>
+        </w:tc>
+        <w:tc>
+          <w:tcPr>
+            <w:tcW w:w="2340" w:type="dxa"/>
+          </w:tcPr>
+          <w:p>
+            <w:pPr/>
+            <w:r>
+              <w:t xml:space="preserve">Register with a non-Zambian number</w:t>
+            </w:r>
+          </w:p>
+        </w:tc>
+        <w:tc>
+          <w:tcPr>
+            <w:tcW w:w="2340" w:type="dxa"/>
+          </w:tcPr>
+          <w:p>
+            <w:pPr/>
+            <w:r>
+              <w:t xml:space="preserve">Rejected with format message</w:t>
+            </w:r>
+          </w:p>
+        </w:tc>
+        <w:tc>
+          <w:tcPr>
+            <w:tcW w:w="2340" w:type="dxa"/>
+          </w:tcPr>
+          <w:p>
+            <w:pPr/>
+            <w:r>
               <w:t xml:space="preserve">[Pass/Fail]</w:t>
             </w:r>
           </w:p>
@@ -10597,29 +10748,29 @@
           <w:p>
             <w:pPr/>
             <w:r>
-              <w:t xml:space="preserve">TC-02</w:t>
-            </w:r>
-          </w:p>
-        </w:tc>
-        <w:tc>
-          <w:tcPr>
-            <w:tcW w:w="2340" w:type="dxa"/>
-          </w:tcPr>
-          <w:p>
-            <w:pPr/>
-            <w:r>
-              <w:t xml:space="preserve">Register with a non-Zambian number</w:t>
-            </w:r>
-          </w:p>
-        </w:tc>
-        <w:tc>
-          <w:tcPr>
-            <w:tcW w:w="2340" w:type="dxa"/>
-          </w:tcPr>
-          <w:p>
-            <w:pPr/>
-            <w:r>
-              <w:t xml:space="preserve">Rejected with format message</w:t>
+              <w:t xml:space="preserve">TC-03</w:t>
+            </w:r>
+          </w:p>
+        </w:tc>
+        <w:tc>
+          <w:tcPr>
+            <w:tcW w:w="2340" w:type="dxa"/>
+          </w:tcPr>
+          <w:p>
+            <w:pPr/>
+            <w:r>
+              <w:t xml:space="preserve">Enter wrong OTP four times</w:t>
+            </w:r>
+          </w:p>
+        </w:tc>
+        <w:tc>
+          <w:tcPr>
+            <w:tcW w:w="2340" w:type="dxa"/>
+          </w:tcPr>
+          <w:p>
+            <w:pPr/>
+            <w:r>
+              <w:t xml:space="preserve">Code invalidated after 3 attempts</w:t>
             </w:r>
           </w:p>
         </w:tc>
@@ -10643,29 +10794,75 @@
           <w:p>
             <w:pPr/>
             <w:r>
-              <w:t xml:space="preserve">TC-03</w:t>
-            </w:r>
-          </w:p>
-        </w:tc>
-        <w:tc>
-          <w:tcPr>
-            <w:tcW w:w="2340" w:type="dxa"/>
-          </w:tcPr>
-          <w:p>
-            <w:pPr/>
-            <w:r>
-              <w:t xml:space="preserve">Enter wrong OTP four times</w:t>
-            </w:r>
-          </w:p>
-        </w:tc>
-        <w:tc>
-          <w:tcPr>
-            <w:tcW w:w="2340" w:type="dxa"/>
-          </w:tcPr>
-          <w:p>
-            <w:pPr/>
-            <w:r>
-              <w:t xml:space="preserve">Code invalidated after 3 attempts</w:t>
+              <w:t xml:space="preserve">TC-04</w:t>
+            </w:r>
+          </w:p>
+        </w:tc>
+        <w:tc>
+          <w:tcPr>
+            <w:tcW w:w="2340" w:type="dxa"/>
+          </w:tcPr>
+          <w:p>
+            <w:pPr/>
+            <w:r>
+              <w:t xml:space="preserve">Seller creates listing with photo</w:t>
+            </w:r>
+          </w:p>
+        </w:tc>
+        <w:tc>
+          <w:tcPr>
+            <w:tcW w:w="2340" w:type="dxa"/>
+          </w:tcPr>
+          <w:p>
+            <w:pPr/>
+            <w:r>
+              <w:t xml:space="preserve">Listing appears in Browse; LISTING_CREATED block added</w:t>
+            </w:r>
+          </w:p>
+        </w:tc>
+        <w:tc>
+          <w:tcPr>
+            <w:tcW w:w="2340" w:type="dxa"/>
+          </w:tcPr>
+          <w:p>
+            <w:pPr/>
+            <w:r>
+              <w:t xml:space="preserve">Pass (hosted, Android phone)</w:t>
+            </w:r>
+          </w:p>
+        </w:tc>
+      </w:tr>
+      <w:tr>
+        <w:tc>
+          <w:tcPr>
+            <w:tcW w:w="2340" w:type="dxa"/>
+          </w:tcPr>
+          <w:p>
+            <w:pPr/>
+            <w:r>
+              <w:t xml:space="preserve">TC-05</w:t>
+            </w:r>
+          </w:p>
+        </w:tc>
+        <w:tc>
+          <w:tcPr>
+            <w:tcW w:w="2340" w:type="dxa"/>
+          </w:tcPr>
+          <w:p>
+            <w:pPr/>
+            <w:r>
+              <w:t xml:space="preserve">Buyer filters by Kanyama, K80–K120, minimum 5 bags</w:t>
+            </w:r>
+          </w:p>
+        </w:tc>
+        <w:tc>
+          <w:tcPr>
+            <w:tcW w:w="2340" w:type="dxa"/>
+          </w:tcPr>
+          <w:p>
+            <w:pPr/>
+            <w:r>
+              <w:t xml:space="preserve">Only matching listings shown</w:t>
             </w:r>
           </w:p>
         </w:tc>
@@ -10689,29 +10886,121 @@
           <w:p>
             <w:pPr/>
             <w:r>
-              <w:t xml:space="preserve">TC-04</w:t>
-            </w:r>
-          </w:p>
-        </w:tc>
-        <w:tc>
-          <w:tcPr>
-            <w:tcW w:w="2340" w:type="dxa"/>
-          </w:tcPr>
-          <w:p>
-            <w:pPr/>
-            <w:r>
-              <w:t xml:space="preserve">Seller creates listing with photo</w:t>
-            </w:r>
-          </w:p>
-        </w:tc>
-        <w:tc>
-          <w:tcPr>
-            <w:tcW w:w="2340" w:type="dxa"/>
-          </w:tcPr>
-          <w:p>
-            <w:pPr/>
-            <w:r>
-              <w:t xml:space="preserve">Listing appears in Browse; LISTING_CREATED block added</w:t>
+              <w:t xml:space="preserve">TC-06</w:t>
+            </w:r>
+          </w:p>
+        </w:tc>
+        <w:tc>
+          <w:tcPr>
+            <w:tcW w:w="2340" w:type="dxa"/>
+          </w:tcPr>
+          <w:p>
+            <w:pPr/>
+            <w:r>
+              <w:t xml:space="preserve">Seller dictates a listing on Android Chrome</w:t>
+            </w:r>
+          </w:p>
+        </w:tc>
+        <w:tc>
+          <w:tcPr>
+            <w:tcW w:w="2340" w:type="dxa"/>
+          </w:tcPr>
+          <w:p>
+            <w:pPr/>
+            <w:r>
+              <w:t xml:space="preserve">Fields pre-filled and marked "from voice"</w:t>
+            </w:r>
+          </w:p>
+        </w:tc>
+        <w:tc>
+          <w:tcPr>
+            <w:tcW w:w="2340" w:type="dxa"/>
+          </w:tcPr>
+          <w:p>
+            <w:pPr/>
+            <w:r>
+              <w:t xml:space="preserve">Pass (hosted, Android phone)</w:t>
+            </w:r>
+          </w:p>
+        </w:tc>
+      </w:tr>
+      <w:tr>
+        <w:tc>
+          <w:tcPr>
+            <w:tcW w:w="2340" w:type="dxa"/>
+          </w:tcPr>
+          <w:p>
+            <w:pPr/>
+            <w:r>
+              <w:t xml:space="preserve">TC-07</w:t>
+            </w:r>
+          </w:p>
+        </w:tc>
+        <w:tc>
+          <w:tcPr>
+            <w:tcW w:w="2340" w:type="dxa"/>
+          </w:tcPr>
+          <w:p>
+            <w:pPr/>
+            <w:r>
+              <w:t xml:space="preserve">Buyer messages seller</w:t>
+            </w:r>
+          </w:p>
+        </w:tc>
+        <w:tc>
+          <w:tcPr>
+            <w:tcW w:w="2340" w:type="dxa"/>
+          </w:tcPr>
+          <w:p>
+            <w:pPr/>
+            <w:r>
+              <w:t xml:space="preserve">Message appears instantly for both</w:t>
+            </w:r>
+          </w:p>
+        </w:tc>
+        <w:tc>
+          <w:tcPr>
+            <w:tcW w:w="2340" w:type="dxa"/>
+          </w:tcPr>
+          <w:p>
+            <w:pPr/>
+            <w:r>
+              <w:t xml:space="preserve">Pass (laptop to phone)</w:t>
+            </w:r>
+          </w:p>
+        </w:tc>
+      </w:tr>
+      <w:tr>
+        <w:tc>
+          <w:tcPr>
+            <w:tcW w:w="2340" w:type="dxa"/>
+          </w:tcPr>
+          <w:p>
+            <w:pPr/>
+            <w:r>
+              <w:t xml:space="preserve">TC-08</w:t>
+            </w:r>
+          </w:p>
+        </w:tc>
+        <w:tc>
+          <w:tcPr>
+            <w:tcW w:w="2340" w:type="dxa"/>
+          </w:tcPr>
+          <w:p>
+            <w:pPr/>
+            <w:r>
+              <w:t xml:space="preserve">Buyer sends message while offline, then reconnects</w:t>
+            </w:r>
+          </w:p>
+        </w:tc>
+        <w:tc>
+          <w:tcPr>
+            <w:tcW w:w="2340" w:type="dxa"/>
+          </w:tcPr>
+          <w:p>
+            <w:pPr/>
+            <w:r>
+              <w:t xml:space="preserve">Message queued, then delivered once</w:t>
             </w:r>
           </w:p>
         </w:tc>
@@ -10735,29 +11024,29 @@
           <w:p>
             <w:pPr/>
             <w:r>
-              <w:t xml:space="preserve">TC-05</w:t>
-            </w:r>
-          </w:p>
-        </w:tc>
-        <w:tc>
-          <w:tcPr>
-            <w:tcW w:w="2340" w:type="dxa"/>
-          </w:tcPr>
-          <w:p>
-            <w:pPr/>
-            <w:r>
-              <w:t xml:space="preserve">Buyer filters by Kanyama, K80–K120, minimum 5 bags</w:t>
-            </w:r>
-          </w:p>
-        </w:tc>
-        <w:tc>
-          <w:tcPr>
-            <w:tcW w:w="2340" w:type="dxa"/>
-          </w:tcPr>
-          <w:p>
-            <w:pPr/>
-            <w:r>
-              <w:t xml:space="preserve">Only matching listings shown</w:t>
+              <w:t xml:space="preserve">TC-09</w:t>
+            </w:r>
+          </w:p>
+        </w:tc>
+        <w:tc>
+          <w:tcPr>
+            <w:tcW w:w="2340" w:type="dxa"/>
+          </w:tcPr>
+          <w:p>
+            <w:pPr/>
+            <w:r>
+              <w:t xml:space="preserve">Open Browse offline after an earlier visit</w:t>
+            </w:r>
+          </w:p>
+        </w:tc>
+        <w:tc>
+          <w:tcPr>
+            <w:tcW w:w="2340" w:type="dxa"/>
+          </w:tcPr>
+          <w:p>
+            <w:pPr/>
+            <w:r>
+              <w:t xml:space="preserve">Cached listings shown</w:t>
             </w:r>
           </w:p>
         </w:tc>
@@ -10781,29 +11070,29 @@
           <w:p>
             <w:pPr/>
             <w:r>
-              <w:t xml:space="preserve">TC-06</w:t>
-            </w:r>
-          </w:p>
-        </w:tc>
-        <w:tc>
-          <w:tcPr>
-            <w:tcW w:w="2340" w:type="dxa"/>
-          </w:tcPr>
-          <w:p>
-            <w:pPr/>
-            <w:r>
-              <w:t xml:space="preserve">Seller dictates a listing on Android Chrome</w:t>
-            </w:r>
-          </w:p>
-        </w:tc>
-        <w:tc>
-          <w:tcPr>
-            <w:tcW w:w="2340" w:type="dxa"/>
-          </w:tcPr>
-          <w:p>
-            <w:pPr/>
-            <w:r>
-              <w:t xml:space="preserve">Fields pre-filled and marked "from voice"</w:t>
+              <w:t xml:space="preserve">TC-10</w:t>
+            </w:r>
+          </w:p>
+        </w:tc>
+        <w:tc>
+          <w:tcPr>
+            <w:tcW w:w="2340" w:type="dxa"/>
+          </w:tcPr>
+          <w:p>
+            <w:pPr/>
+            <w:r>
+              <w:t xml:space="preserve">Buyer with no conversation tries to rate</w:t>
+            </w:r>
+          </w:p>
+        </w:tc>
+        <w:tc>
+          <w:tcPr>
+            <w:tcW w:w="2340" w:type="dxa"/>
+          </w:tcPr>
+          <w:p>
+            <w:pPr/>
+            <w:r>
+              <w:t xml:space="preserve">Rejected (403)</w:t>
             </w:r>
           </w:p>
         </w:tc>
@@ -10827,29 +11116,29 @@
           <w:p>
             <w:pPr/>
             <w:r>
-              <w:t xml:space="preserve">TC-07</w:t>
-            </w:r>
-          </w:p>
-        </w:tc>
-        <w:tc>
-          <w:tcPr>
-            <w:tcW w:w="2340" w:type="dxa"/>
-          </w:tcPr>
-          <w:p>
-            <w:pPr/>
-            <w:r>
-              <w:t xml:space="preserve">Buyer messages seller</w:t>
-            </w:r>
-          </w:p>
-        </w:tc>
-        <w:tc>
-          <w:tcPr>
-            <w:tcW w:w="2340" w:type="dxa"/>
-          </w:tcPr>
-          <w:p>
-            <w:pPr/>
-            <w:r>
-              <w:t xml:space="preserve">Message appears instantly for both</w:t>
+              <w:t xml:space="preserve">TC-11</w:t>
+            </w:r>
+          </w:p>
+        </w:tc>
+        <w:tc>
+          <w:tcPr>
+            <w:tcW w:w="2340" w:type="dxa"/>
+          </w:tcPr>
+          <w:p>
+            <w:pPr/>
+            <w:r>
+              <w:t xml:space="preserve">Buyer rates the same conversation twice</w:t>
+            </w:r>
+          </w:p>
+        </w:tc>
+        <w:tc>
+          <w:tcPr>
+            <w:tcW w:w="2340" w:type="dxa"/>
+          </w:tcPr>
+          <w:p>
+            <w:pPr/>
+            <w:r>
+              <w:t xml:space="preserve">Second rating rejected (409)</w:t>
             </w:r>
           </w:p>
         </w:tc>
@@ -10873,29 +11162,29 @@
           <w:p>
             <w:pPr/>
             <w:r>
-              <w:t xml:space="preserve">TC-08</w:t>
-            </w:r>
-          </w:p>
-        </w:tc>
-        <w:tc>
-          <w:tcPr>
-            <w:tcW w:w="2340" w:type="dxa"/>
-          </w:tcPr>
-          <w:p>
-            <w:pPr/>
-            <w:r>
-              <w:t xml:space="preserve">Buyer sends message while offline, then reconnects</w:t>
-            </w:r>
-          </w:p>
-        </w:tc>
-        <w:tc>
-          <w:tcPr>
-            <w:tcW w:w="2340" w:type="dxa"/>
-          </w:tcPr>
-          <w:p>
-            <w:pPr/>
-            <w:r>
-              <w:t xml:space="preserve">Message queued, then delivered once</w:t>
+              <w:t xml:space="preserve">TC-12</w:t>
+            </w:r>
+          </w:p>
+        </w:tc>
+        <w:tc>
+          <w:tcPr>
+            <w:tcW w:w="2340" w:type="dxa"/>
+          </w:tcPr>
+          <w:p>
+            <w:pPr/>
+            <w:r>
+              <w:t xml:space="preserve">Edit a TrustChain document in MongoDB Atlas, then open Trust Score page</w:t>
+            </w:r>
+          </w:p>
+        </w:tc>
+        <w:tc>
+          <w:tcPr>
+            <w:tcW w:w="2340" w:type="dxa"/>
+          </w:tcPr>
+          <w:p>
+            <w:pPr/>
+            <w:r>
+              <w:t xml:space="preserve">Red warning: record has been altered</w:t>
             </w:r>
           </w:p>
         </w:tc>
@@ -10919,29 +11208,29 @@
           <w:p>
             <w:pPr/>
             <w:r>
-              <w:t xml:space="preserve">TC-09</w:t>
-            </w:r>
-          </w:p>
-        </w:tc>
-        <w:tc>
-          <w:tcPr>
-            <w:tcW w:w="2340" w:type="dxa"/>
-          </w:tcPr>
-          <w:p>
-            <w:pPr/>
-            <w:r>
-              <w:t xml:space="preserve">Open Browse offline after an earlier visit</w:t>
-            </w:r>
-          </w:p>
-        </w:tc>
-        <w:tc>
-          <w:tcPr>
-            <w:tcW w:w="2340" w:type="dxa"/>
-          </w:tcPr>
-          <w:p>
-            <w:pPr/>
-            <w:r>
-              <w:t xml:space="preserve">Cached listings shown</w:t>
+              <w:t xml:space="preserve">TC-13</w:t>
+            </w:r>
+          </w:p>
+        </w:tc>
+        <w:tc>
+          <w:tcPr>
+            <w:tcW w:w="2340" w:type="dxa"/>
+          </w:tcPr>
+          <w:p>
+            <w:pPr/>
+            <w:r>
+              <w:t xml:space="preserve">Buyer opens an admin route</w:t>
+            </w:r>
+          </w:p>
+        </w:tc>
+        <w:tc>
+          <w:tcPr>
+            <w:tcW w:w="2340" w:type="dxa"/>
+          </w:tcPr>
+          <w:p>
+            <w:pPr/>
+            <w:r>
+              <w:t xml:space="preserve">Access denied (403)</w:t>
             </w:r>
           </w:p>
         </w:tc>
@@ -10965,190 +11254,6 @@
           <w:p>
             <w:pPr/>
             <w:r>
-              <w:t xml:space="preserve">TC-10</w:t>
-            </w:r>
-          </w:p>
-        </w:tc>
-        <w:tc>
-          <w:tcPr>
-            <w:tcW w:w="2340" w:type="dxa"/>
-          </w:tcPr>
-          <w:p>
-            <w:pPr/>
-            <w:r>
-              <w:t xml:space="preserve">Buyer with no conversation tries to rate</w:t>
-            </w:r>
-          </w:p>
-        </w:tc>
-        <w:tc>
-          <w:tcPr>
-            <w:tcW w:w="2340" w:type="dxa"/>
-          </w:tcPr>
-          <w:p>
-            <w:pPr/>
-            <w:r>
-              <w:t xml:space="preserve">Rejected (403)</w:t>
-            </w:r>
-          </w:p>
-        </w:tc>
-        <w:tc>
-          <w:tcPr>
-            <w:tcW w:w="2340" w:type="dxa"/>
-          </w:tcPr>
-          <w:p>
-            <w:pPr/>
-            <w:r>
-              <w:t xml:space="preserve">[Pass/Fail]</w:t>
-            </w:r>
-          </w:p>
-        </w:tc>
-      </w:tr>
-      <w:tr>
-        <w:tc>
-          <w:tcPr>
-            <w:tcW w:w="2340" w:type="dxa"/>
-          </w:tcPr>
-          <w:p>
-            <w:pPr/>
-            <w:r>
-              <w:t xml:space="preserve">TC-11</w:t>
-            </w:r>
-          </w:p>
-        </w:tc>
-        <w:tc>
-          <w:tcPr>
-            <w:tcW w:w="2340" w:type="dxa"/>
-          </w:tcPr>
-          <w:p>
-            <w:pPr/>
-            <w:r>
-              <w:t xml:space="preserve">Buyer rates the same conversation twice</w:t>
-            </w:r>
-          </w:p>
-        </w:tc>
-        <w:tc>
-          <w:tcPr>
-            <w:tcW w:w="2340" w:type="dxa"/>
-          </w:tcPr>
-          <w:p>
-            <w:pPr/>
-            <w:r>
-              <w:t xml:space="preserve">Second rating rejected (409)</w:t>
-            </w:r>
-          </w:p>
-        </w:tc>
-        <w:tc>
-          <w:tcPr>
-            <w:tcW w:w="2340" w:type="dxa"/>
-          </w:tcPr>
-          <w:p>
-            <w:pPr/>
-            <w:r>
-              <w:t xml:space="preserve">[Pass/Fail]</w:t>
-            </w:r>
-          </w:p>
-        </w:tc>
-      </w:tr>
-      <w:tr>
-        <w:tc>
-          <w:tcPr>
-            <w:tcW w:w="2340" w:type="dxa"/>
-          </w:tcPr>
-          <w:p>
-            <w:pPr/>
-            <w:r>
-              <w:t xml:space="preserve">TC-12</w:t>
-            </w:r>
-          </w:p>
-        </w:tc>
-        <w:tc>
-          <w:tcPr>
-            <w:tcW w:w="2340" w:type="dxa"/>
-          </w:tcPr>
-          <w:p>
-            <w:pPr/>
-            <w:r>
-              <w:t xml:space="preserve">Edit a TrustChain document in MongoDB Atlas, then open Trust Score page</w:t>
-            </w:r>
-          </w:p>
-        </w:tc>
-        <w:tc>
-          <w:tcPr>
-            <w:tcW w:w="2340" w:type="dxa"/>
-          </w:tcPr>
-          <w:p>
-            <w:pPr/>
-            <w:r>
-              <w:t xml:space="preserve">Red warning: record has been altered</w:t>
-            </w:r>
-          </w:p>
-        </w:tc>
-        <w:tc>
-          <w:tcPr>
-            <w:tcW w:w="2340" w:type="dxa"/>
-          </w:tcPr>
-          <w:p>
-            <w:pPr/>
-            <w:r>
-              <w:t xml:space="preserve">[Pass/Fail]</w:t>
-            </w:r>
-          </w:p>
-        </w:tc>
-      </w:tr>
-      <w:tr>
-        <w:tc>
-          <w:tcPr>
-            <w:tcW w:w="2340" w:type="dxa"/>
-          </w:tcPr>
-          <w:p>
-            <w:pPr/>
-            <w:r>
-              <w:t xml:space="preserve">TC-13</w:t>
-            </w:r>
-          </w:p>
-        </w:tc>
-        <w:tc>
-          <w:tcPr>
-            <w:tcW w:w="2340" w:type="dxa"/>
-          </w:tcPr>
-          <w:p>
-            <w:pPr/>
-            <w:r>
-              <w:t xml:space="preserve">Buyer opens an admin route</w:t>
-            </w:r>
-          </w:p>
-        </w:tc>
-        <w:tc>
-          <w:tcPr>
-            <w:tcW w:w="2340" w:type="dxa"/>
-          </w:tcPr>
-          <w:p>
-            <w:pPr/>
-            <w:r>
-              <w:t xml:space="preserve">Access denied (403)</w:t>
-            </w:r>
-          </w:p>
-        </w:tc>
-        <w:tc>
-          <w:tcPr>
-            <w:tcW w:w="2340" w:type="dxa"/>
-          </w:tcPr>
-          <w:p>
-            <w:pPr/>
-            <w:r>
-              <w:t xml:space="preserve">[Pass/Fail]</w:t>
-            </w:r>
-          </w:p>
-        </w:tc>
-      </w:tr>
-      <w:tr>
-        <w:tc>
-          <w:tcPr>
-            <w:tcW w:w="2340" w:type="dxa"/>
-          </w:tcPr>
-          <w:p>
-            <w:pPr/>
-            <w:r>
               <w:t xml:space="preserve">TC-14</w:t>
             </w:r>
           </w:p>
@@ -11182,7 +11287,7 @@
           <w:p>
             <w:pPr/>
             <w:r>
-              <w:t xml:space="preserve">[Pass/Fail]</w:t>
+              <w:t xml:space="preserve">Pass (hosted)</w:t>
             </w:r>
           </w:p>
         </w:tc>
@@ -11283,6 +11388,98 @@
           <w:p>
             <w:pPr/>
             <w:r>
+              <w:t xml:space="preserve">Pass (hosted)</w:t>
+            </w:r>
+          </w:p>
+        </w:tc>
+      </w:tr>
+      <w:tr>
+        <w:tc>
+          <w:tcPr>
+            <w:tcW w:w="2340" w:type="dxa"/>
+          </w:tcPr>
+          <w:p>
+            <w:pPr/>
+            <w:r>
+              <w:t xml:space="preserve">TC-17</w:t>
+            </w:r>
+          </w:p>
+        </w:tc>
+        <w:tc>
+          <w:tcPr>
+            <w:tcW w:w="2340" w:type="dxa"/>
+          </w:tcPr>
+          <w:p>
+            <w:pPr/>
+            <w:r>
+              <w:t xml:space="preserve">Hosted frontend (Vercel) loads listings and chat from hosted API (Render)</w:t>
+            </w:r>
+          </w:p>
+        </w:tc>
+        <w:tc>
+          <w:tcPr>
+            <w:tcW w:w="2340" w:type="dxa"/>
+          </w:tcPr>
+          <w:p>
+            <w:pPr/>
+            <w:r>
+              <w:t xml:space="preserve">Pages load; chat connects</w:t>
+            </w:r>
+          </w:p>
+        </w:tc>
+        <w:tc>
+          <w:tcPr>
+            <w:tcW w:w="2340" w:type="dxa"/>
+          </w:tcPr>
+          <w:p>
+            <w:pPr/>
+            <w:r>
+              <w:t xml:space="preserve">Pass (12 October 2026, Android phone on mobile data)</w:t>
+            </w:r>
+          </w:p>
+        </w:tc>
+      </w:tr>
+      <w:tr>
+        <w:tc>
+          <w:tcPr>
+            <w:tcW w:w="2340" w:type="dxa"/>
+          </w:tcPr>
+          <w:p>
+            <w:pPr/>
+            <w:r>
+              <w:t xml:space="preserve">TC-18</w:t>
+            </w:r>
+          </w:p>
+        </w:tc>
+        <w:tc>
+          <w:tcPr>
+            <w:tcW w:w="2340" w:type="dxa"/>
+          </w:tcPr>
+          <w:p>
+            <w:pPr/>
+            <w:r>
+              <w:t xml:space="preserve">Seller creates a listing with a photo while offline, then reconnects</w:t>
+            </w:r>
+          </w:p>
+        </w:tc>
+        <w:tc>
+          <w:tcPr>
+            <w:tcW w:w="2340" w:type="dxa"/>
+          </w:tcPr>
+          <w:p>
+            <w:pPr/>
+            <w:r>
+              <w:t xml:space="preserve">Saved as a draft; posted automatically on reconnection</w:t>
+            </w:r>
+          </w:p>
+        </w:tc>
+        <w:tc>
+          <w:tcPr>
+            <w:tcW w:w="2340" w:type="dxa"/>
+          </w:tcPr>
+          <w:p>
+            <w:pPr/>
+            <w:r>
               <w:t xml:space="preserve">[Pass/Fail]</w:t>
             </w:r>
           </w:p>
@@ -11296,29 +11493,29 @@
           <w:p>
             <w:pPr/>
             <w:r>
-              <w:t xml:space="preserve">TC-17</w:t>
-            </w:r>
-          </w:p>
-        </w:tc>
-        <w:tc>
-          <w:tcPr>
-            <w:tcW w:w="2340" w:type="dxa"/>
-          </w:tcPr>
-          <w:p>
-            <w:pPr/>
-            <w:r>
-              <w:t xml:space="preserve">Hosted frontend (Vercel) loads listings and chat from hosted API (Render)</w:t>
-            </w:r>
-          </w:p>
-        </w:tc>
-        <w:tc>
-          <w:tcPr>
-            <w:tcW w:w="2340" w:type="dxa"/>
-          </w:tcPr>
-          <w:p>
-            <w:pPr/>
-            <w:r>
-              <w:t xml:space="preserve">Pages load; chat connects</w:t>
+              <w:t xml:space="preserve">TC-19</w:t>
+            </w:r>
+          </w:p>
+        </w:tc>
+        <w:tc>
+          <w:tcPr>
+            <w:tcW w:w="2340" w:type="dxa"/>
+          </w:tcPr>
+          <w:p>
+            <w:pPr/>
+            <w:r>
+              <w:t xml:space="preserve">Seller uploads a photo over 5 MB from a phone</w:t>
+            </w:r>
+          </w:p>
+        </w:tc>
+        <w:tc>
+          <w:tcPr>
+            <w:tcW w:w="2340" w:type="dxa"/>
+          </w:tcPr>
+          <w:p>
+            <w:pPr/>
+            <w:r>
+              <w:t xml:space="preserve">Photo shrunk on the phone; listing created</w:t>
             </w:r>
           </w:p>
         </w:tc>
@@ -11342,29 +11539,29 @@
           <w:p>
             <w:pPr/>
             <w:r>
-              <w:t xml:space="preserve">TC-18</w:t>
-            </w:r>
-          </w:p>
-        </w:tc>
-        <w:tc>
-          <w:tcPr>
-            <w:tcW w:w="2340" w:type="dxa"/>
-          </w:tcPr>
-          <w:p>
-            <w:pPr/>
-            <w:r>
-              <w:t xml:space="preserve">Seller creates a listing with a photo while offline, then reconnects</w:t>
-            </w:r>
-          </w:p>
-        </w:tc>
-        <w:tc>
-          <w:tcPr>
-            <w:tcW w:w="2340" w:type="dxa"/>
-          </w:tcPr>
-          <w:p>
-            <w:pPr/>
-            <w:r>
-              <w:t xml:space="preserve">Saved as a draft; posted automatically on reconnection</w:t>
+              <w:t xml:space="preserve">TC-20</w:t>
+            </w:r>
+          </w:p>
+        </w:tc>
+        <w:tc>
+          <w:tcPr>
+            <w:tcW w:w="2340" w:type="dxa"/>
+          </w:tcPr>
+          <w:p>
+            <w:pPr/>
+            <w:r>
+              <w:t xml:space="preserve">After TC-12, admin opens the Integrity tab</w:t>
+            </w:r>
+          </w:p>
+        </w:tc>
+        <w:tc>
+          <w:tcPr>
+            <w:tcW w:w="2340" w:type="dxa"/>
+          </w:tcPr>
+          <w:p>
+            <w:pPr/>
+            <w:r>
+              <w:t xml:space="preserve">That seller listed as failing verification; badge on the tab</w:t>
             </w:r>
           </w:p>
         </w:tc>
@@ -11388,29 +11585,29 @@
           <w:p>
             <w:pPr/>
             <w:r>
-              <w:t xml:space="preserve">TC-19</w:t>
-            </w:r>
-          </w:p>
-        </w:tc>
-        <w:tc>
-          <w:tcPr>
-            <w:tcW w:w="2340" w:type="dxa"/>
-          </w:tcPr>
-          <w:p>
-            <w:pPr/>
-            <w:r>
-              <w:t xml:space="preserve">Seller uploads a photo over 5 MB from a phone</w:t>
-            </w:r>
-          </w:p>
-        </w:tc>
-        <w:tc>
-          <w:tcPr>
-            <w:tcW w:w="2340" w:type="dxa"/>
-          </w:tcPr>
-          <w:p>
-            <w:pPr/>
-            <w:r>
-              <w:t xml:space="preserve">Photo shrunk on the phone; listing created</w:t>
+              <w:t xml:space="preserve">TC-21</w:t>
+            </w:r>
+          </w:p>
+        </w:tc>
+        <w:tc>
+          <w:tcPr>
+            <w:tcW w:w="2340" w:type="dxa"/>
+          </w:tcPr>
+          <w:p>
+            <w:pPr/>
+            <w:r>
+              <w:t xml:space="preserve">Admin suspends a seller, giving a reason</w:t>
+            </w:r>
+          </w:p>
+        </w:tc>
+        <w:tc>
+          <w:tcPr>
+            <w:tcW w:w="2340" w:type="dxa"/>
+          </w:tcPr>
+          <w:p>
+            <w:pPr/>
+            <w:r>
+              <w:t xml:space="preserve">Seller's listings paused; entry with the reason in the Activity tab</w:t>
             </w:r>
           </w:p>
         </w:tc>
@@ -11434,86 +11631,40 @@
           <w:p>
             <w:pPr/>
             <w:r>
-              <w:t xml:space="preserve">TC-20</w:t>
-            </w:r>
-          </w:p>
-        </w:tc>
-        <w:tc>
-          <w:tcPr>
-            <w:tcW w:w="2340" w:type="dxa"/>
-          </w:tcPr>
-          <w:p>
-            <w:pPr/>
-            <w:r>
-              <w:t xml:space="preserve">After TC-12, admin opens the Integrity tab</w:t>
-            </w:r>
-          </w:p>
-        </w:tc>
-        <w:tc>
-          <w:tcPr>
-            <w:tcW w:w="2340" w:type="dxa"/>
-          </w:tcPr>
-          <w:p>
-            <w:pPr/>
-            <w:r>
-              <w:t xml:space="preserve">That seller listed as failing verification; badge on the tab</w:t>
-            </w:r>
-          </w:p>
-        </w:tc>
-        <w:tc>
-          <w:tcPr>
-            <w:tcW w:w="2340" w:type="dxa"/>
-          </w:tcPr>
-          <w:p>
-            <w:pPr/>
-            <w:r>
-              <w:t xml:space="preserve">[Pass/Fail]</w:t>
-            </w:r>
-          </w:p>
-        </w:tc>
-      </w:tr>
-      <w:tr>
-        <w:tc>
-          <w:tcPr>
-            <w:tcW w:w="2340" w:type="dxa"/>
-          </w:tcPr>
-          <w:p>
-            <w:pPr/>
-            <w:r>
-              <w:t xml:space="preserve">TC-21</w:t>
-            </w:r>
-          </w:p>
-        </w:tc>
-        <w:tc>
-          <w:tcPr>
-            <w:tcW w:w="2340" w:type="dxa"/>
-          </w:tcPr>
-          <w:p>
-            <w:pPr/>
-            <w:r>
-              <w:t xml:space="preserve">Admin suspends a seller, giving a reason</w:t>
-            </w:r>
-          </w:p>
-        </w:tc>
-        <w:tc>
-          <w:tcPr>
-            <w:tcW w:w="2340" w:type="dxa"/>
-          </w:tcPr>
-          <w:p>
-            <w:pPr/>
-            <w:r>
-              <w:t xml:space="preserve">Seller's listings paused; entry with the reason in the Activity tab</w:t>
-            </w:r>
-          </w:p>
-        </w:tc>
-        <w:tc>
-          <w:tcPr>
-            <w:tcW w:w="2340" w:type="dxa"/>
-          </w:tcPr>
-          <w:p>
-            <w:pPr/>
-            <w:r>
-              <w:t xml:space="preserve">[Pass/Fail]</w:t>
+              <w:t xml:space="preserve">TC-22</w:t>
+            </w:r>
+          </w:p>
+        </w:tc>
+        <w:tc>
+          <w:tcPr>
+            <w:tcW w:w="2340" w:type="dxa"/>
+          </w:tcPr>
+          <w:p>
+            <w:pPr/>
+            <w:r>
+              <w:t xml:space="preserve">Install the hosted app from Chrome on Android</w:t>
+            </w:r>
+          </w:p>
+        </w:tc>
+        <w:tc>
+          <w:tcPr>
+            <w:tcW w:w="2340" w:type="dxa"/>
+          </w:tcPr>
+          <w:p>
+            <w:pPr/>
+            <w:r>
+              <w:t xml:space="preserve">"Install app" offered; app opens from the home screen</w:t>
+            </w:r>
+          </w:p>
+        </w:tc>
+        <w:tc>
+          <w:tcPr>
+            <w:tcW w:w="2340" w:type="dxa"/>
+          </w:tcPr>
+          <w:p>
+            <w:pPr/>
+            <w:r>
+              <w:t xml:space="preserve">Pass (after PNG icons were added)</w:t>
             </w:r>
           </w:p>
         </w:tc>
@@ -11697,18 +11848,18 @@
           <w:p>
             <w:pPr/>
             <w:r>
-              <w:t xml:space="preserve">Voice module and parser; 12 of 12 parser tests pass; browser flow checked with simulated speech</w:t>
-            </w:r>
-          </w:p>
-        </w:tc>
-        <w:tc>
-          <w:tcPr>
-            <w:tcW w:w="3120" w:type="dxa"/>
-          </w:tcPr>
-          <w:p>
-            <w:pPr/>
-            <w:r>
-              <w:t xml:space="preserve">Achieved for English; real-microphone test (TC-06) to be recorded</w:t>
+              <w:t xml:space="preserve">Voice module and parser; 13 of 13 parser tests pass; dictation tested on an Android phone (TC-06)</w:t>
+            </w:r>
+          </w:p>
+        </w:tc>
+        <w:tc>
+          <w:tcPr>
+            <w:tcW w:w="3120" w:type="dxa"/>
+          </w:tcPr>
+          <w:p>
+            <w:pPr/>
+            <w:r>
+              <w:t xml:space="preserve">Achieved for English</w:t>
             </w:r>
           </w:p>
         </w:tc>
@@ -11732,7 +11883,7 @@
           <w:p>
             <w:pPr/>
             <w:r>
-              <w:t xml:space="preserve">60 of 60 backend tests pass, including the head-hash check and per-conversation rating</w:t>
+              <w:t xml:space="preserve">73 of 73 backend tests pass, including the head-hash check and per-conversation rating</w:t>
             </w:r>
           </w:p>
         </w:tc>
@@ -12135,10 +12286,10 @@
         <w:rPr>
           <w:b/>
         </w:rPr>
-        <w:t xml:space="preserve">Not yet redeployed.</w:t>
-      </w:r>
-      <w:r>
-        <w:t xml:space="preserve"> The deployment faults have been fixed in code, but the hosted system has not yet been verified, so performance on real networks and devices is not known.</w:t>
+        <w:t xml:space="preserve">Limited field testing.</w:t>
+      </w:r>
+      <w:r>
+        <w:t xml:space="preserve"> The hosted system was verified by the developer on one Android phone and a laptop; performance with many users on real Zambian networks has not been measured.</w:t>
       </w:r>
     </w:p>
     <w:p>
@@ -12182,7 +12333,7 @@
     <w:p>
       <w:pPr/>
       <w:r>
-        <w:t xml:space="preserve">ZamMarket addresses discovery and trust for cash-settled charcoal trading in a combination no reviewed platform documents. The trust chain is the strongest result. Voice input and offline support are partial, and the absence of user evaluation and deployment is the main limit on the conclusions.</w:t>
+        <w:t xml:space="preserve">ZamMarket addresses discovery and trust for cash-settled charcoal trading in a combination no reviewed platform documents. The trust chain is the strongest result. Voice input and offline support are partial, and the absence of user evaluation is the main limit on the conclusions.</w:t>
       </w:r>
     </w:p>
     <w:p>
@@ -12218,7 +12369,7 @@
     <w:p>
       <w:pPr/>
       <w:r>
-        <w:t xml:space="preserve">Informal charcoal sellers in Lusaka lack a way to reach nearby buyers, and buyers lack a way to judge sellers they have not met. Existing platforms offer either local discovery without trust or trust that depends on online payment. Over four agile sprints and a stabilisation period, this project built ZamMarket, a mobile-first PWA with neighbourhood-based discovery, English voice-based listing creation, real-time chat with offline queuing, and a seller trust score backed by a SHA-256 hash chain with conversation-gated ratings. Unit tests confirmed that the chain detects edited, deleted and reordered history and verifies 1,000 blocks in a few milliseconds. An automated suite of 72 tests, run on every push, confirms the trust chain (including the most recent event), the rating rules and the voice parser. Usability testing and redeployment remain outstanding.</w:t>
+        <w:t xml:space="preserve">Informal charcoal sellers in Lusaka lack a way to reach nearby buyers, and buyers lack a way to judge sellers they have not met. Existing platforms offer either local discovery without trust or trust that depends on online payment. Over four agile sprints and a stabilisation period, this project built ZamMarket, a mobile-first PWA with neighbourhood-based discovery, English voice-based listing creation, real-time chat with offline queuing, and a seller trust score backed by a SHA-256 hash chain with conversation-gated ratings. Unit tests confirmed that the chain detects edited, deleted and reordered history and verifies 1,000 blocks in a few milliseconds. An automated suite of 86 tests, run on every push, confirms the trust chain (including the most recent event), the rating rules and the voice parser. The system is deployed at https://zam-market-khaki.vercel.app; usability testing remains outstanding.</w:t>
       </w:r>
     </w:p>
     <w:p>
@@ -12395,10 +12546,10 @@
         <w:rPr>
           <w:b/>
         </w:rPr>
-        <w:t xml:space="preserve">Redeploy and verify</w:t>
-      </w:r>
-      <w:r>
-        <w:t xml:space="preserve"> using the checklist in the repository README: set </w:t>
+        <w:t xml:space="preserve">Keep the hosted system verified</w:t>
+      </w:r>
+      <w:r>
+        <w:t xml:space="preserve"> after every change, using the checklist in Appendix B: set </w:t>
       </w:r>
       <w:r>
         <w:rPr>
@@ -12512,10 +12663,10 @@
         <w:rPr>
           <w:b/>
         </w:rPr>
-        <w:t xml:space="preserve">Replace simulated OTP</w:t>
-      </w:r>
-      <w:r>
-        <w:t xml:space="preserve"> with an SMS provider before real use.</w:t>
+        <w:t xml:space="preserve">Switch on real SMS for OTP</w:t>
+      </w:r>
+      <w:r>
+        <w:t xml:space="preserve"> before real use: top up an Africa's Talking account, which reaches MTN, Airtel and Zamtel, and set SMS_PROVIDER, AT_USERNAME and AT_API_KEY on the server.</w:t>
       </w:r>
     </w:p>
     <w:p>
@@ -13286,7 +13437,52 @@
         <w:t xml:space="preserve">FRONTEND_URL</w:t>
       </w:r>
       <w:r>
-        <w:t xml:space="preserve">.</w:t>
+        <w:t xml:space="preserve">. </w:t>
+      </w:r>
+      <w:r>
+        <w:rPr>
+          <w:rStyle w:val="CodeChar"/>
+        </w:rPr>
+        <w:t xml:space="preserve">SMS_PROVIDER</w:t>
+      </w:r>
+      <w:r>
+        <w:t xml:space="preserve"> defaults to </w:t>
+      </w:r>
+      <w:r>
+        <w:rPr>
+          <w:rStyle w:val="CodeChar"/>
+        </w:rPr>
+        <w:t xml:space="preserve">console</w:t>
+      </w:r>
+      <w:r>
+        <w:t xml:space="preserve">, which writes registration codes to the server log; set it to </w:t>
+      </w:r>
+      <w:r>
+        <w:rPr>
+          <w:rStyle w:val="CodeChar"/>
+        </w:rPr>
+        <w:t xml:space="preserve">africastalking</w:t>
+      </w:r>
+      <w:r>
+        <w:t xml:space="preserve"> or </w:t>
+      </w:r>
+      <w:r>
+        <w:rPr>
+          <w:rStyle w:val="CodeChar"/>
+        </w:rPr>
+        <w:t xml:space="preserve">twilio</w:t>
+      </w:r>
+      <w:r>
+        <w:t xml:space="preserve">, with that provider's keys, to send real SMS (</w:t>
+      </w:r>
+      <w:r>
+        <w:rPr>
+          <w:rStyle w:val="CodeChar"/>
+        </w:rPr>
+        <w:t xml:space="preserve">npm run test-sms -- 0971234567</w:t>
+      </w:r>
+      <w:r>
+        <w:t xml:space="preserve"> checks the set-up).</w:t>
       </w:r>
     </w:p>
     <w:p>
@@ -13449,6 +13645,96 @@
       </w:r>
       <w:r>
         <w:t xml:space="preserve">.</w:t>
+      </w:r>
+    </w:p>
+    <w:p>
+      <w:pPr>
+        <w:pStyle w:val="ListParagraph"/>
+        <w:numPr>
+          <w:ilvl w:val="0"/>
+          <w:numId w:val="21"/>
+        </w:numPr>
+      </w:pPr>
+      <w:r>
+        <w:rPr>
+          <w:b/>
+        </w:rPr>
+        <w:t xml:space="preserve">Hosted deployment</w:t>
+      </w:r>
+      <w:r>
+        <w:t xml:space="preserve"> (as used for the live system at https://zam-market-khaki.vercel.app): the backend runs on Render (root directory </w:t>
+      </w:r>
+      <w:r>
+        <w:rPr>
+          <w:rStyle w:val="CodeChar"/>
+        </w:rPr>
+        <w:t xml:space="preserve">backend</w:t>
+      </w:r>
+      <w:r>
+        <w:t xml:space="preserve">, start command </w:t>
+      </w:r>
+      <w:r>
+        <w:rPr>
+          <w:rStyle w:val="CodeChar"/>
+        </w:rPr>
+        <w:t xml:space="preserve">npm start</w:t>
+      </w:r>
+      <w:r>
+        <w:t xml:space="preserve">, with the variables above and </w:t>
+      </w:r>
+      <w:r>
+        <w:rPr>
+          <w:rStyle w:val="CodeChar"/>
+        </w:rPr>
+        <w:t xml:space="preserve">FRONTEND_URL</w:t>
+      </w:r>
+      <w:r>
+        <w:t xml:space="preserve"> set to the Vercel address); the frontend runs on Vercel (root directory </w:t>
+      </w:r>
+      <w:r>
+        <w:rPr>
+          <w:rStyle w:val="CodeChar"/>
+        </w:rPr>
+        <w:t xml:space="preserve">frontend</w:t>
+      </w:r>
+      <w:r>
+        <w:t xml:space="preserve">, with </w:t>
+      </w:r>
+      <w:r>
+        <w:rPr>
+          <w:rStyle w:val="CodeChar"/>
+        </w:rPr>
+        <w:t xml:space="preserve">VITE_API_URL</w:t>
+      </w:r>
+      <w:r>
+        <w:t xml:space="preserve"> ending in </w:t>
+      </w:r>
+      <w:r>
+        <w:rPr>
+          <w:rStyle w:val="CodeChar"/>
+        </w:rPr>
+        <w:t xml:space="preserve">/api</w:t>
+      </w:r>
+      <w:r>
+        <w:t xml:space="preserve"> and </w:t>
+      </w:r>
+      <w:r>
+        <w:rPr>
+          <w:rStyle w:val="CodeChar"/>
+        </w:rPr>
+        <w:t xml:space="preserve">VITE_SOCKET_URL</w:t>
+      </w:r>
+      <w:r>
+        <w:t xml:space="preserve"> without it). MongoDB Atlas must allow access from anywhere (0.0.0.0/0). </w:t>
+      </w:r>
+      <w:r>
+        <w:rPr>
+          <w:rStyle w:val="CodeChar"/>
+        </w:rPr>
+        <w:t xml:space="preserve">GET /api/health</w:t>
+      </w:r>
+      <w:r>
+        <w:t xml:space="preserve"> reports the database, Cloudinary and SMS status.</w:t>
       </w:r>
     </w:p>
     <w:p>
@@ -14212,7 +14498,7 @@
         <w:t xml:space="preserve">backend/</w:t>
       </w:r>
       <w:r>
-        <w:t xml:space="preserve"> (60 Jest tests in backend/__tests__/ and </w:t>
+        <w:t xml:space="preserve"> (73 Jest tests in backend/__tests__/ and </w:t>
       </w:r>
       <w:r>
         <w:rPr>
@@ -14239,7 +14525,7 @@
         <w:t xml:space="preserve">frontend/</w:t>
       </w:r>
       <w:r>
-        <w:t xml:space="preserve"> (12 tests in </w:t>
+        <w:t xml:space="preserve"> (13 tests in </w:t>
       </w:r>
       <w:r>
         <w:rPr>

</xml_diff>